<commit_message>
fix: arrumando o README
</commit_message>
<xml_diff>
--- a/Documentacao_Capp.docx
+++ b/Documentacao_Capp.docx
@@ -5,47 +5,80 @@
     <w:p>
       <w:pPr>
         <w:spacing w:after="240" w:before="1800" w:lineRule="auto"/>
+        <w:ind w:firstLine="0"/>
         <w:jc w:val="center"/>
-        <w:rPr/>
-      </w:pPr>
-      <w:r>
-        <w:rPr>
-          <w:rFonts w:ascii="Arial" w:cs="Arial" w:eastAsia="Arial" w:hAnsi="Arial"/>
+        <w:rPr>
           <w:b w:val="1"/>
           <w:bCs w:val="1"/>
-          <w:color w:val="7c3aed"/>
-          <w:sz w:val="80"/>
-          <w:szCs w:val="80"/>
-          <w:rtl w:val="0"/>
-        </w:rPr>
-        <w:t xml:space="preserve">CAPP</w:t>
-      </w:r>
-      <w:r>
-        <w:rPr>
-          <w:rtl w:val="0"/>
-        </w:rPr>
-      </w:r>
-    </w:p>
-    <w:p>
-      <w:pPr>
-        <w:spacing w:after="160" w:lineRule="auto"/>
-        <w:jc w:val="center"/>
-        <w:rPr/>
-      </w:pPr>
-      <w:r>
-        <w:rPr>
-          <w:rFonts w:ascii="Arial" w:cs="Arial" w:eastAsia="Arial" w:hAnsi="Arial"/>
           <w:color w:val="374151"/>
           <w:sz w:val="28"/>
           <w:szCs w:val="28"/>
+        </w:rPr>
+      </w:pPr>
+      <w:r>
+        <w:rPr>
+          <w:b w:val="1"/>
+          <w:bCs w:val="1"/>
+          <w:rtl w:val="0"/>
+        </w:rPr>
+        <w:t xml:space="preserve">  </w:t>
+      </w:r>
+      <w:r>
+        <w:rPr>
+          <w:b w:val="1"/>
+          <w:bCs w:val="1"/>
+        </w:rPr>
+        <w:drawing>
+          <wp:anchor allowOverlap="1" behindDoc="0" distB="114300" distT="114300" distL="114300" distR="114300" hidden="0" layoutInCell="1" locked="0" relativeHeight="0" simplePos="0">
+            <wp:simplePos x="0" y="0"/>
+            <wp:positionH relativeFrom="page">
+              <wp:posOffset>933450</wp:posOffset>
+            </wp:positionH>
+            <wp:positionV relativeFrom="page">
+              <wp:posOffset>2076450</wp:posOffset>
+            </wp:positionV>
+            <wp:extent cx="5731200" cy="5105400"/>
+            <wp:effectExtent b="0" l="0" r="0" t="0"/>
+            <wp:wrapSquare wrapText="bothSides" distB="114300" distT="114300" distL="114300" distR="114300"/>
+            <wp:docPr id="8" name="image6.png"/>
+            <a:graphic>
+              <a:graphicData uri="http://schemas.openxmlformats.org/drawingml/2006/picture">
+                <pic:pic>
+                  <pic:nvPicPr>
+                    <pic:cNvPr id="0" name="image6.png"/>
+                    <pic:cNvPicPr preferRelativeResize="0"/>
+                  </pic:nvPicPr>
+                  <pic:blipFill>
+                    <a:blip r:embed="rId6"/>
+                    <a:srcRect b="0" l="0" r="0" t="0"/>
+                    <a:stretch>
+                      <a:fillRect/>
+                    </a:stretch>
+                  </pic:blipFill>
+                  <pic:spPr>
+                    <a:xfrm>
+                      <a:off x="0" y="0"/>
+                      <a:ext cx="5731200" cy="5105400"/>
+                    </a:xfrm>
+                    <a:prstGeom prst="rect"/>
+                    <a:ln/>
+                  </pic:spPr>
+                </pic:pic>
+              </a:graphicData>
+            </a:graphic>
+          </wp:anchor>
+        </w:drawing>
+      </w:r>
+      <w:r>
+        <w:rPr>
+          <w:b w:val="1"/>
+          <w:bCs w:val="1"/>
+          <w:color w:val="374151"/>
+          <w:sz w:val="28"/>
+          <w:szCs w:val="28"/>
           <w:rtl w:val="0"/>
         </w:rPr>
         <w:t xml:space="preserve">Sistema de Gerenciamento de Chamados para Condomínio</w:t>
-      </w:r>
-      <w:r>
-        <w:rPr>
-          <w:rtl w:val="0"/>
-        </w:rPr>
       </w:r>
     </w:p>
     <w:p>
@@ -209,6 +242,7 @@
     <w:p>
       <w:pPr>
         <w:spacing w:after="120" w:lineRule="auto"/>
+        <w:jc w:val="both"/>
         <w:rPr/>
       </w:pPr>
       <w:r>
@@ -218,7 +252,22 @@
           <w:szCs w:val="22"/>
           <w:rtl w:val="0"/>
         </w:rPr>
-        <w:t xml:space="preserve">O Capp é um sistema web de gerenciamento de chamados para condomínios, desenvolvido em Ruby on Rails como solução para o Desafio Técnico Nº 0004/2026. Ele permite que moradores registrem chamados de manutenção, segurança, limpeza e outros tipos, enquanto colaboradores os gerenciam e administradores controlam toda a estrutura do condomínio.</w:t>
+        <w:t xml:space="preserve">O Cap</w:t>
+      </w:r>
+      <w:r>
+        <w:rPr>
+          <w:rtl w:val="0"/>
+        </w:rPr>
+        <w:t xml:space="preserve">p (Condomínio App)</w:t>
+      </w:r>
+      <w:r>
+        <w:rPr>
+          <w:rFonts w:ascii="Arial" w:cs="Arial" w:eastAsia="Arial" w:hAnsi="Arial"/>
+          <w:sz w:val="22"/>
+          <w:szCs w:val="22"/>
+          <w:rtl w:val="0"/>
+        </w:rPr>
+        <w:t xml:space="preserve"> é um sistema web de gerenciamento de chamados para condomínios, desenvolvido em Ruby on Rails como solução para o Desafio Técnico Nº 0004/2026. Ele permite que moradores registrem chamados de manutenção, segurança, limpeza e outros tipos, enquanto colaboradores os gerenciam e administradores controlam toda a estrutura do condomínio.</w:t>
       </w:r>
       <w:r>
         <w:rPr>
@@ -262,6 +311,7 @@
     <w:p>
       <w:pPr>
         <w:spacing w:after="120" w:lineRule="auto"/>
+        <w:jc w:val="both"/>
         <w:rPr/>
       </w:pPr>
       <w:r>
@@ -332,7 +382,7 @@
         <w:shd w:fill="auto" w:val="clear"/>
         <w:spacing w:after="80" w:before="0" w:line="240" w:lineRule="auto"/>
         <w:ind w:left="720" w:right="0" w:hanging="360"/>
-        <w:jc w:val="left"/>
+        <w:jc w:val="both"/>
         <w:rPr/>
       </w:pPr>
       <w:r>
@@ -375,7 +425,7 @@
         <w:shd w:fill="auto" w:val="clear"/>
         <w:spacing w:after="80" w:before="0" w:line="240" w:lineRule="auto"/>
         <w:ind w:left="720" w:right="0" w:hanging="360"/>
-        <w:jc w:val="left"/>
+        <w:jc w:val="both"/>
         <w:rPr/>
       </w:pPr>
       <w:r>
@@ -418,7 +468,7 @@
         <w:shd w:fill="auto" w:val="clear"/>
         <w:spacing w:after="80" w:before="0" w:line="240" w:lineRule="auto"/>
         <w:ind w:left="720" w:right="0" w:hanging="360"/>
-        <w:jc w:val="left"/>
+        <w:jc w:val="both"/>
         <w:rPr/>
       </w:pPr>
       <w:r>
@@ -461,7 +511,7 @@
         <w:shd w:fill="auto" w:val="clear"/>
         <w:spacing w:after="80" w:before="0" w:line="240" w:lineRule="auto"/>
         <w:ind w:left="720" w:right="0" w:hanging="360"/>
-        <w:jc w:val="left"/>
+        <w:jc w:val="both"/>
         <w:rPr/>
       </w:pPr>
       <w:r>
@@ -504,7 +554,7 @@
         <w:shd w:fill="auto" w:val="clear"/>
         <w:spacing w:after="80" w:before="0" w:line="240" w:lineRule="auto"/>
         <w:ind w:left="720" w:right="0" w:hanging="360"/>
-        <w:jc w:val="left"/>
+        <w:jc w:val="both"/>
         <w:rPr/>
       </w:pPr>
       <w:r>
@@ -547,7 +597,7 @@
         <w:shd w:fill="auto" w:val="clear"/>
         <w:spacing w:after="80" w:before="0" w:line="240" w:lineRule="auto"/>
         <w:ind w:left="720" w:right="0" w:hanging="360"/>
-        <w:jc w:val="left"/>
+        <w:jc w:val="both"/>
         <w:rPr/>
       </w:pPr>
       <w:r>
@@ -590,7 +640,7 @@
         <w:shd w:fill="auto" w:val="clear"/>
         <w:spacing w:after="80" w:before="0" w:line="240" w:lineRule="auto"/>
         <w:ind w:left="720" w:right="0" w:hanging="360"/>
-        <w:jc w:val="left"/>
+        <w:jc w:val="both"/>
         <w:rPr/>
       </w:pPr>
       <w:r>
@@ -633,7 +683,7 @@
         <w:shd w:fill="auto" w:val="clear"/>
         <w:spacing w:after="80" w:before="0" w:line="240" w:lineRule="auto"/>
         <w:ind w:left="720" w:right="0" w:hanging="360"/>
-        <w:jc w:val="left"/>
+        <w:jc w:val="both"/>
         <w:rPr/>
       </w:pPr>
       <w:r>
@@ -676,7 +726,7 @@
         <w:shd w:fill="auto" w:val="clear"/>
         <w:spacing w:after="80" w:before="0" w:line="240" w:lineRule="auto"/>
         <w:ind w:left="720" w:right="0" w:hanging="360"/>
-        <w:jc w:val="left"/>
+        <w:jc w:val="both"/>
         <w:rPr/>
       </w:pPr>
       <w:r>
@@ -719,7 +769,7 @@
         <w:shd w:fill="auto" w:val="clear"/>
         <w:spacing w:after="80" w:before="0" w:line="240" w:lineRule="auto"/>
         <w:ind w:left="720" w:right="0" w:hanging="360"/>
-        <w:jc w:val="left"/>
+        <w:jc w:val="both"/>
         <w:rPr/>
       </w:pPr>
       <w:r>
@@ -762,7 +812,7 @@
         <w:shd w:fill="auto" w:val="clear"/>
         <w:spacing w:after="80" w:before="0" w:line="240" w:lineRule="auto"/>
         <w:ind w:left="720" w:right="0" w:hanging="360"/>
-        <w:jc w:val="left"/>
+        <w:jc w:val="both"/>
         <w:rPr/>
       </w:pPr>
       <w:r>
@@ -782,7 +832,57 @@
           <w:vertAlign w:val="baseline"/>
           <w:rtl w:val="0"/>
         </w:rPr>
-        <w:t xml:space="preserve">Interface responsiva com tema escuro e menu sanduíche em mobile</w:t>
+        <w:t xml:space="preserve">Interface responsiva com tema escuro</w:t>
+      </w:r>
+      <w:r>
+        <w:rPr>
+          <w:rtl w:val="0"/>
+        </w:rPr>
+        <w:t xml:space="preserve">/</w:t>
+      </w:r>
+      <w:r>
+        <w:rPr>
+          <w:rFonts w:ascii="Arial" w:cs="Arial" w:eastAsia="Arial" w:hAnsi="Arial"/>
+          <w:b w:val="0"/>
+          <w:bCs w:val="0"/>
+          <w:i w:val="0"/>
+          <w:iCs w:val="0"/>
+          <w:smallCaps w:val="0"/>
+          <w:strike w:val="0"/>
+          <w:color w:val="000000"/>
+          <w:sz w:val="22"/>
+          <w:szCs w:val="22"/>
+          <w:u w:val="none"/>
+          <w:shd w:fill="auto" w:val="clear"/>
+          <w:vertAlign w:val="baseline"/>
+          <w:rtl w:val="0"/>
+        </w:rPr>
+        <w:t xml:space="preserve">claro </w:t>
+      </w:r>
+      <w:r>
+        <w:rPr>
+          <w:rtl w:val="0"/>
+        </w:rPr>
+        <w:t xml:space="preserve">e</w:t>
+      </w:r>
+      <w:r>
+        <w:rPr>
+          <w:rFonts w:ascii="Arial" w:cs="Arial" w:eastAsia="Arial" w:hAnsi="Arial"/>
+          <w:b w:val="0"/>
+          <w:bCs w:val="0"/>
+          <w:i w:val="0"/>
+          <w:iCs w:val="0"/>
+          <w:smallCaps w:val="0"/>
+          <w:strike w:val="0"/>
+          <w:color w:val="000000"/>
+          <w:sz w:val="22"/>
+          <w:szCs w:val="22"/>
+          <w:u w:val="none"/>
+          <w:shd w:fill="auto" w:val="clear"/>
+          <w:vertAlign w:val="baseline"/>
+          <w:rtl w:val="0"/>
+        </w:rPr>
+        <w:t xml:space="preserve"> menu sanduíche em mobile</w:t>
       </w:r>
     </w:p>
     <w:p>
@@ -805,7 +905,7 @@
         <w:shd w:fill="auto" w:val="clear"/>
         <w:spacing w:after="80" w:before="0" w:line="240" w:lineRule="auto"/>
         <w:ind w:left="720" w:right="0" w:hanging="360"/>
-        <w:jc w:val="left"/>
+        <w:jc w:val="both"/>
         <w:rPr/>
       </w:pPr>
       <w:r>
@@ -1595,7 +1695,24 @@
                 <w:szCs w:val="20"/>
                 <w:rtl w:val="0"/>
               </w:rPr>
-              <w:t xml:space="preserve">~&gt; 4.4 — utility-first, tema escuro</w:t>
+              <w:t xml:space="preserve">~&gt; </w:t>
+            </w:r>
+            <w:r>
+              <w:rPr>
+                <w:sz w:val="20"/>
+                <w:szCs w:val="20"/>
+                <w:rtl w:val="0"/>
+              </w:rPr>
+              <w:t xml:space="preserve">4.4</w:t>
+            </w:r>
+            <w:r>
+              <w:rPr>
+                <w:rFonts w:ascii="Arial" w:cs="Arial" w:eastAsia="Arial" w:hAnsi="Arial"/>
+                <w:sz w:val="20"/>
+                <w:szCs w:val="20"/>
+                <w:rtl w:val="0"/>
+              </w:rPr>
+              <w:t xml:space="preserve"> — utility-first, tema escuro</w:t>
             </w:r>
             <w:r>
               <w:rPr>
@@ -1937,7 +2054,15 @@
                 <w:szCs w:val="20"/>
                 <w:rtl w:val="0"/>
               </w:rPr>
-              <w:t xml:space="preserve">Nativo do Rails; suporte a AWS S3</w:t>
+              <w:t xml:space="preserve">Nativo do Rails;</w:t>
+            </w:r>
+            <w:r>
+              <w:rPr>
+                <w:sz w:val="20"/>
+                <w:szCs w:val="20"/>
+                <w:rtl w:val="0"/>
+              </w:rPr>
+              <w:t xml:space="preserve"> suporte a Cloudflare R2</w:t>
             </w:r>
             <w:r>
               <w:rPr>
@@ -2010,12 +2135,11 @@
             </w:pPr>
             <w:r>
               <w:rPr>
-                <w:rFonts w:ascii="Arial" w:cs="Arial" w:eastAsia="Arial" w:hAnsi="Arial"/>
-                <w:sz w:val="20"/>
-                <w:szCs w:val="20"/>
-                <w:rtl w:val="0"/>
-              </w:rPr>
-              <w:t xml:space="preserve">AWS SDK S3</w:t>
+                <w:sz w:val="20"/>
+                <w:szCs w:val="20"/>
+                <w:rtl w:val="0"/>
+              </w:rPr>
+              <w:t xml:space="preserve">Cloudflare R2</w:t>
             </w:r>
             <w:r>
               <w:rPr>
@@ -2046,12 +2170,11 @@
             </w:pPr>
             <w:r>
               <w:rPr>
-                <w:rFonts w:ascii="Arial" w:cs="Arial" w:eastAsia="Arial" w:hAnsi="Arial"/>
-                <w:sz w:val="20"/>
-                <w:szCs w:val="20"/>
-                <w:rtl w:val="0"/>
-              </w:rPr>
-              <w:t xml:space="preserve">Para uploads em produção</w:t>
+                <w:sz w:val="20"/>
+                <w:szCs w:val="20"/>
+                <w:rtl w:val="0"/>
+              </w:rPr>
+              <w:t xml:space="preserve">Storage de arquivos em produção</w:t>
             </w:r>
             <w:r>
               <w:rPr>
@@ -2156,16 +2279,28 @@
           </w:tcPr>
           <w:p>
             <w:pPr>
-              <w:rPr/>
-            </w:pPr>
-            <w:r>
-              <w:rPr>
-                <w:rFonts w:ascii="Arial" w:cs="Arial" w:eastAsia="Arial" w:hAnsi="Arial"/>
-                <w:sz w:val="20"/>
-                <w:szCs w:val="20"/>
-                <w:rtl w:val="0"/>
-              </w:rPr>
-              <w:t xml:space="preserve">Soluções nativas Rails 8 baseadas em DB</w:t>
+              <w:rPr>
+                <w:sz w:val="20"/>
+                <w:szCs w:val="20"/>
+              </w:rPr>
+            </w:pPr>
+            <w:r>
+              <w:rPr>
+                <w:sz w:val="20"/>
+                <w:szCs w:val="20"/>
+                <w:rtl w:val="0"/>
+              </w:rPr>
+              <w:t xml:space="preserve">Cache/Queue: </w:t>
+            </w:r>
+            <w:r>
+              <w:rPr>
+                <w:i w:val="1"/>
+                <w:iCs w:val="1"/>
+                <w:sz w:val="20"/>
+                <w:szCs w:val="20"/>
+                <w:rtl w:val="0"/>
+              </w:rPr>
+              <w:t xml:space="preserve">Solid Cache + Solid Queue + Solid Cable</w:t>
             </w:r>
             <w:r>
               <w:rPr>
@@ -2202,12 +2337,11 @@
             </w:pPr>
             <w:r>
               <w:rPr>
-                <w:rFonts w:ascii="Arial" w:cs="Arial" w:eastAsia="Arial" w:hAnsi="Arial"/>
-                <w:sz w:val="20"/>
-                <w:szCs w:val="20"/>
-                <w:rtl w:val="0"/>
-              </w:rPr>
-              <w:t xml:space="preserve">Containerização</w:t>
+                <w:sz w:val="20"/>
+                <w:szCs w:val="20"/>
+                <w:rtl w:val="0"/>
+              </w:rPr>
+              <w:t xml:space="preserve">Conteinerização</w:t>
             </w:r>
             <w:r>
               <w:rPr>
@@ -2352,12 +2486,11 @@
             </w:pPr>
             <w:r>
               <w:rPr>
-                <w:rFonts w:ascii="Arial" w:cs="Arial" w:eastAsia="Arial" w:hAnsi="Arial"/>
-                <w:sz w:val="20"/>
-                <w:szCs w:val="20"/>
-                <w:rtl w:val="0"/>
-              </w:rPr>
-              <w:t xml:space="preserve">Kamal + Thruster</w:t>
+                <w:sz w:val="20"/>
+                <w:szCs w:val="20"/>
+                <w:rtl w:val="0"/>
+              </w:rPr>
+              <w:t xml:space="preserve">Render + Cloudflare</w:t>
             </w:r>
             <w:r>
               <w:rPr>
@@ -2388,12 +2521,11 @@
             </w:pPr>
             <w:r>
               <w:rPr>
-                <w:rFonts w:ascii="Arial" w:cs="Arial" w:eastAsia="Arial" w:hAnsi="Arial"/>
-                <w:sz w:val="20"/>
-                <w:szCs w:val="20"/>
-                <w:rtl w:val="0"/>
-              </w:rPr>
-              <w:t xml:space="preserve">Deploy moderno via Docker (Rails 8)</w:t>
+                <w:sz w:val="20"/>
+                <w:szCs w:val="20"/>
+                <w:rtl w:val="0"/>
+              </w:rPr>
+              <w:t xml:space="preserve">Hospedagem da aplicação + DNS</w:t>
             </w:r>
             <w:r>
               <w:rPr>
@@ -3284,6 +3416,7 @@
     <w:p>
       <w:pPr>
         <w:spacing w:after="120" w:lineRule="auto"/>
+        <w:jc w:val="both"/>
         <w:rPr/>
       </w:pPr>
       <w:r>
@@ -3321,7 +3454,7 @@
         <w:shd w:fill="auto" w:val="clear"/>
         <w:spacing w:after="80" w:before="0" w:line="240" w:lineRule="auto"/>
         <w:ind w:left="720" w:right="0" w:hanging="360"/>
-        <w:jc w:val="left"/>
+        <w:jc w:val="both"/>
         <w:rPr/>
       </w:pPr>
       <w:r>
@@ -3364,7 +3497,7 @@
         <w:shd w:fill="auto" w:val="clear"/>
         <w:spacing w:after="80" w:before="0" w:line="240" w:lineRule="auto"/>
         <w:ind w:left="720" w:right="0" w:hanging="360"/>
-        <w:jc w:val="left"/>
+        <w:jc w:val="both"/>
         <w:rPr/>
       </w:pPr>
       <w:r>
@@ -3407,7 +3540,7 @@
         <w:shd w:fill="auto" w:val="clear"/>
         <w:spacing w:after="80" w:before="0" w:line="240" w:lineRule="auto"/>
         <w:ind w:left="720" w:right="0" w:hanging="360"/>
-        <w:jc w:val="left"/>
+        <w:jc w:val="both"/>
         <w:rPr/>
       </w:pPr>
       <w:r>
@@ -3466,6 +3599,7 @@
     <w:p>
       <w:pPr>
         <w:spacing w:after="120" w:lineRule="auto"/>
+        <w:jc w:val="both"/>
         <w:rPr/>
       </w:pPr>
       <w:r>
@@ -3503,7 +3637,7 @@
         <w:shd w:fill="auto" w:val="clear"/>
         <w:spacing w:after="80" w:before="0" w:line="240" w:lineRule="auto"/>
         <w:ind w:left="720" w:right="0" w:hanging="360"/>
-        <w:jc w:val="left"/>
+        <w:jc w:val="both"/>
         <w:rPr/>
       </w:pPr>
       <w:r>
@@ -3546,7 +3680,7 @@
         <w:shd w:fill="auto" w:val="clear"/>
         <w:spacing w:after="80" w:before="0" w:line="240" w:lineRule="auto"/>
         <w:ind w:left="720" w:right="0" w:hanging="360"/>
-        <w:jc w:val="left"/>
+        <w:jc w:val="both"/>
         <w:rPr/>
       </w:pPr>
       <w:r>
@@ -3657,6 +3791,7 @@
     <w:p>
       <w:pPr>
         <w:spacing w:after="120" w:lineRule="auto"/>
+        <w:jc w:val="both"/>
         <w:rPr/>
       </w:pPr>
       <w:r>
@@ -4120,6 +4255,7 @@
     <w:p>
       <w:pPr>
         <w:spacing w:after="120" w:lineRule="auto"/>
+        <w:jc w:val="both"/>
         <w:rPr/>
       </w:pPr>
       <w:r>
@@ -4141,6 +4277,7 @@
       <w:pPr>
         <w:spacing w:after="60" w:before="60" w:lineRule="auto"/>
         <w:ind w:left="720" w:firstLine="0"/>
+        <w:jc w:val="both"/>
         <w:rPr/>
       </w:pPr>
       <w:r>
@@ -4163,6 +4300,7 @@
       <w:pPr>
         <w:spacing w:after="60" w:before="60" w:lineRule="auto"/>
         <w:ind w:left="720" w:firstLine="0"/>
+        <w:jc w:val="both"/>
         <w:rPr/>
       </w:pPr>
       <w:r>
@@ -4185,6 +4323,7 @@
       <w:pPr>
         <w:spacing w:after="60" w:before="60" w:lineRule="auto"/>
         <w:ind w:left="720" w:firstLine="0"/>
+        <w:jc w:val="both"/>
         <w:rPr/>
       </w:pPr>
       <w:r>
@@ -4205,6 +4344,7 @@
     </w:p>
     <w:p>
       <w:pPr>
+        <w:jc w:val="both"/>
         <w:rPr/>
       </w:pPr>
       <w:r>
@@ -4216,6 +4356,7 @@
     <w:p>
       <w:pPr>
         <w:spacing w:after="120" w:lineRule="auto"/>
+        <w:jc w:val="both"/>
         <w:rPr/>
       </w:pPr>
       <w:r>
@@ -4237,6 +4378,7 @@
       <w:pPr>
         <w:spacing w:after="60" w:before="60" w:lineRule="auto"/>
         <w:ind w:left="720" w:firstLine="0"/>
+        <w:jc w:val="both"/>
         <w:rPr/>
       </w:pPr>
       <w:r>
@@ -4259,6 +4401,7 @@
       <w:pPr>
         <w:spacing w:after="60" w:before="60" w:lineRule="auto"/>
         <w:ind w:left="720" w:firstLine="0"/>
+        <w:jc w:val="both"/>
         <w:rPr/>
       </w:pPr>
       <w:r>
@@ -4281,6 +4424,7 @@
       <w:pPr>
         <w:spacing w:after="60" w:before="60" w:lineRule="auto"/>
         <w:ind w:left="720" w:firstLine="0"/>
+        <w:jc w:val="both"/>
         <w:rPr/>
       </w:pPr>
       <w:r>
@@ -4303,6 +4447,7 @@
       <w:pPr>
         <w:spacing w:after="60" w:before="60" w:lineRule="auto"/>
         <w:ind w:left="720" w:firstLine="0"/>
+        <w:jc w:val="both"/>
         <w:rPr/>
       </w:pPr>
       <w:r>
@@ -4325,6 +4470,7 @@
       <w:pPr>
         <w:spacing w:after="60" w:before="60" w:lineRule="auto"/>
         <w:ind w:left="720" w:firstLine="0"/>
+        <w:jc w:val="both"/>
         <w:rPr/>
       </w:pPr>
       <w:r>
@@ -4379,6 +4525,7 @@
     <w:p>
       <w:pPr>
         <w:spacing w:after="120" w:lineRule="auto"/>
+        <w:jc w:val="both"/>
         <w:rPr/>
       </w:pPr>
       <w:r>
@@ -4432,6 +4579,7 @@
     <w:p>
       <w:pPr>
         <w:spacing w:after="120" w:lineRule="auto"/>
+        <w:jc w:val="both"/>
         <w:rPr/>
       </w:pPr>
       <w:r>
@@ -4451,6 +4599,7 @@
     </w:p>
     <w:p>
       <w:pPr>
+        <w:jc w:val="both"/>
         <w:rPr/>
       </w:pPr>
       <w:r>
@@ -4531,6 +4680,7 @@
     <w:p>
       <w:pPr>
         <w:spacing w:after="120" w:lineRule="auto"/>
+        <w:jc w:val="both"/>
         <w:rPr/>
       </w:pPr>
       <w:r>
@@ -4541,6 +4691,49 @@
           <w:rtl w:val="0"/>
         </w:rPr>
         <w:t xml:space="preserve">O banco é gerenciado pelo PostgreSQL e versionado via Rails Migrations. A versão atual do schema é 2026_04_14_225626.</w:t>
+      </w:r>
+      <w:r>
+        <w:rPr/>
+        <w:drawing>
+          <wp:anchor allowOverlap="1" behindDoc="0" distB="114300" distT="114300" distL="114300" distR="114300" hidden="0" layoutInCell="1" locked="0" relativeHeight="0" simplePos="0">
+            <wp:simplePos x="0" y="0"/>
+            <wp:positionH relativeFrom="page">
+              <wp:posOffset>912975</wp:posOffset>
+            </wp:positionH>
+            <wp:positionV relativeFrom="page">
+              <wp:posOffset>2373579</wp:posOffset>
+            </wp:positionV>
+            <wp:extent cx="5731200" cy="2908300"/>
+            <wp:effectExtent b="0" l="0" r="0" t="0"/>
+            <wp:wrapSquare wrapText="bothSides" distB="114300" distT="114300" distL="114300" distR="114300"/>
+            <wp:docPr id="2" name="image5.png"/>
+            <a:graphic>
+              <a:graphicData uri="http://schemas.openxmlformats.org/drawingml/2006/picture">
+                <pic:pic>
+                  <pic:nvPicPr>
+                    <pic:cNvPr id="0" name="image5.png"/>
+                    <pic:cNvPicPr preferRelativeResize="0"/>
+                  </pic:nvPicPr>
+                  <pic:blipFill>
+                    <a:blip r:embed="rId7"/>
+                    <a:srcRect b="0" l="0" r="0" t="0"/>
+                    <a:stretch>
+                      <a:fillRect/>
+                    </a:stretch>
+                  </pic:blipFill>
+                  <pic:spPr>
+                    <a:xfrm>
+                      <a:off x="0" y="0"/>
+                      <a:ext cx="5731200" cy="2908300"/>
+                    </a:xfrm>
+                    <a:prstGeom prst="rect"/>
+                    <a:ln/>
+                  </pic:spPr>
+                </pic:pic>
+              </a:graphicData>
+            </a:graphic>
+          </wp:anchor>
+        </w:drawing>
       </w:r>
       <w:r>
         <w:rPr>
@@ -8996,6 +9189,7 @@
     <w:p>
       <w:pPr>
         <w:spacing w:after="120" w:lineRule="auto"/>
+        <w:jc w:val="both"/>
         <w:rPr/>
       </w:pPr>
       <w:r>
@@ -9033,7 +9227,7 @@
         <w:shd w:fill="auto" w:val="clear"/>
         <w:spacing w:after="80" w:before="0" w:line="240" w:lineRule="auto"/>
         <w:ind w:left="720" w:right="0" w:hanging="360"/>
-        <w:jc w:val="left"/>
+        <w:jc w:val="both"/>
         <w:rPr/>
       </w:pPr>
       <w:r>
@@ -9076,7 +9270,7 @@
         <w:shd w:fill="auto" w:val="clear"/>
         <w:spacing w:after="80" w:before="0" w:line="240" w:lineRule="auto"/>
         <w:ind w:left="720" w:right="0" w:hanging="360"/>
-        <w:jc w:val="left"/>
+        <w:jc w:val="both"/>
         <w:rPr/>
       </w:pPr>
       <w:r>
@@ -9119,7 +9313,7 @@
         <w:shd w:fill="auto" w:val="clear"/>
         <w:spacing w:after="80" w:before="0" w:line="240" w:lineRule="auto"/>
         <w:ind w:left="720" w:right="0" w:hanging="360"/>
-        <w:jc w:val="left"/>
+        <w:jc w:val="both"/>
         <w:rPr/>
       </w:pPr>
       <w:r>
@@ -9201,7 +9395,7 @@
     <w:tbl>
       <w:tblPr>
         <w:tblStyle w:val="Table6"/>
-        <w:tblW w:w="9000.0" w:type="dxa"/>
+        <w:tblW w:w="9990.0" w:type="dxa"/>
         <w:jc w:val="left"/>
         <w:tblBorders>
           <w:top w:color="000000" w:space="0" w:sz="4" w:val="single"/>
@@ -9215,14 +9409,14 @@
         <w:tblLook w:val="0000"/>
       </w:tblPr>
       <w:tblGrid>
-        <w:gridCol w:w="3200"/>
-        <w:gridCol w:w="1400"/>
-        <w:gridCol w:w="4400"/>
+        <w:gridCol w:w="3195"/>
+        <w:gridCol w:w="1395"/>
+        <w:gridCol w:w="5400"/>
         <w:tblGridChange w:id="0">
           <w:tblGrid>
-            <w:gridCol w:w="3200"/>
-            <w:gridCol w:w="1400"/>
-            <w:gridCol w:w="4400"/>
+            <w:gridCol w:w="3195"/>
+            <w:gridCol w:w="1395"/>
+            <w:gridCol w:w="5400"/>
           </w:tblGrid>
         </w:tblGridChange>
       </w:tblGrid>
@@ -9828,21 +10022,18 @@
           </w:tcPr>
           <w:p>
             <w:pPr>
-              <w:rPr/>
-            </w:pPr>
-            <w:r>
-              <w:rPr>
-                <w:rFonts w:ascii="Arial" w:cs="Arial" w:eastAsia="Arial" w:hAnsi="Arial"/>
-                <w:sz w:val="20"/>
-                <w:szCs w:val="20"/>
-                <w:rtl w:val="0"/>
-              </w:rPr>
-              <w:t xml:space="preserve">/blocos</w:t>
-            </w:r>
-            <w:r>
-              <w:rPr>
-                <w:rtl w:val="0"/>
-              </w:rPr>
+              <w:rPr>
+                <w:sz w:val="20"/>
+                <w:szCs w:val="20"/>
+              </w:rPr>
+            </w:pPr>
+            <w:r>
+              <w:rPr>
+                <w:sz w:val="20"/>
+                <w:szCs w:val="20"/>
+                <w:rtl w:val="0"/>
+              </w:rPr>
+              <w:t xml:space="preserve">/chamados/:id/remover_anexo</w:t>
             </w:r>
           </w:p>
         </w:tc>
@@ -9864,16 +10055,19 @@
           </w:tcPr>
           <w:p>
             <w:pPr>
-              <w:rPr/>
-            </w:pPr>
-            <w:r>
-              <w:rPr>
-                <w:rFonts w:ascii="Arial" w:cs="Arial" w:eastAsia="Arial" w:hAnsi="Arial"/>
-                <w:sz w:val="20"/>
-                <w:szCs w:val="20"/>
-                <w:rtl w:val="0"/>
-              </w:rPr>
-              <w:t xml:space="preserve">CRUD</w:t>
+              <w:rPr>
+                <w:rFonts w:ascii="Arial" w:cs="Arial" w:eastAsia="Arial" w:hAnsi="Arial"/>
+                <w:sz w:val="20"/>
+                <w:szCs w:val="20"/>
+              </w:rPr>
+            </w:pPr>
+            <w:r>
+              <w:rPr>
+                <w:sz w:val="20"/>
+                <w:szCs w:val="20"/>
+                <w:rtl w:val="0"/>
+              </w:rPr>
+              <w:t xml:space="preserve">DELETE </w:t>
             </w:r>
             <w:r>
               <w:rPr>
@@ -9900,16 +10094,19 @@
           </w:tcPr>
           <w:p>
             <w:pPr>
-              <w:rPr/>
-            </w:pPr>
-            <w:r>
-              <w:rPr>
-                <w:rFonts w:ascii="Arial" w:cs="Arial" w:eastAsia="Arial" w:hAnsi="Arial"/>
-                <w:sz w:val="20"/>
-                <w:szCs w:val="20"/>
-                <w:rtl w:val="0"/>
-              </w:rPr>
-              <w:t xml:space="preserve">Somente administrador</w:t>
+              <w:rPr>
+                <w:rFonts w:ascii="Arial" w:cs="Arial" w:eastAsia="Arial" w:hAnsi="Arial"/>
+                <w:sz w:val="20"/>
+                <w:szCs w:val="20"/>
+              </w:rPr>
+            </w:pPr>
+            <w:r>
+              <w:rPr>
+                <w:sz w:val="20"/>
+                <w:szCs w:val="20"/>
+                <w:rtl w:val="0"/>
+              </w:rPr>
+              <w:t xml:space="preserve">Admin e morador (dono do chamado)</w:t>
             </w:r>
             <w:r>
               <w:rPr>
@@ -9932,43 +10129,43 @@
               <w:bottom w:color="ddd0f5" w:space="0" w:sz="4" w:val="single"/>
               <w:right w:color="ddd0f5" w:space="0" w:sz="4" w:val="single"/>
             </w:tcBorders>
-            <w:shd w:fill="ffffff" w:val="clear"/>
-            <w:tcMar>
-              <w:top w:w="80.0" w:type="dxa"/>
-              <w:left w:w="140.0" w:type="dxa"/>
-              <w:bottom w:w="80.0" w:type="dxa"/>
-              <w:right w:w="140.0" w:type="dxa"/>
-            </w:tcMar>
-          </w:tcPr>
-          <w:p>
-            <w:pPr>
-              <w:rPr/>
-            </w:pPr>
-            <w:r>
-              <w:rPr>
-                <w:rFonts w:ascii="Arial" w:cs="Arial" w:eastAsia="Arial" w:hAnsi="Arial"/>
-                <w:sz w:val="20"/>
-                <w:szCs w:val="20"/>
-                <w:rtl w:val="0"/>
-              </w:rPr>
-              <w:t xml:space="preserve">/usuarios</w:t>
-            </w:r>
-            <w:r>
-              <w:rPr>
-                <w:rtl w:val="0"/>
-              </w:rPr>
-            </w:r>
-          </w:p>
-        </w:tc>
-        <w:tc>
-          <w:tcPr>
-            <w:tcBorders>
-              <w:top w:color="ddd0f5" w:space="0" w:sz="4" w:val="single"/>
-              <w:left w:color="ddd0f5" w:space="0" w:sz="4" w:val="single"/>
-              <w:bottom w:color="ddd0f5" w:space="0" w:sz="4" w:val="single"/>
-              <w:right w:color="ddd0f5" w:space="0" w:sz="4" w:val="single"/>
-            </w:tcBorders>
-            <w:shd w:fill="ffffff" w:val="clear"/>
+            <w:shd w:fill="f5f0ff" w:val="clear"/>
+            <w:tcMar>
+              <w:top w:w="80.0" w:type="dxa"/>
+              <w:left w:w="140.0" w:type="dxa"/>
+              <w:bottom w:w="80.0" w:type="dxa"/>
+              <w:right w:w="140.0" w:type="dxa"/>
+            </w:tcMar>
+          </w:tcPr>
+          <w:p>
+            <w:pPr>
+              <w:rPr/>
+            </w:pPr>
+            <w:r>
+              <w:rPr>
+                <w:rFonts w:ascii="Arial" w:cs="Arial" w:eastAsia="Arial" w:hAnsi="Arial"/>
+                <w:sz w:val="20"/>
+                <w:szCs w:val="20"/>
+                <w:rtl w:val="0"/>
+              </w:rPr>
+              <w:t xml:space="preserve">/blocos</w:t>
+            </w:r>
+            <w:r>
+              <w:rPr>
+                <w:rtl w:val="0"/>
+              </w:rPr>
+            </w:r>
+          </w:p>
+        </w:tc>
+        <w:tc>
+          <w:tcPr>
+            <w:tcBorders>
+              <w:top w:color="ddd0f5" w:space="0" w:sz="4" w:val="single"/>
+              <w:left w:color="ddd0f5" w:space="0" w:sz="4" w:val="single"/>
+              <w:bottom w:color="ddd0f5" w:space="0" w:sz="4" w:val="single"/>
+              <w:right w:color="ddd0f5" w:space="0" w:sz="4" w:val="single"/>
+            </w:tcBorders>
+            <w:shd w:fill="f5f0ff" w:val="clear"/>
             <w:tcMar>
               <w:top w:w="80.0" w:type="dxa"/>
               <w:left w:w="140.0" w:type="dxa"/>
@@ -10004,7 +10201,7 @@
               <w:bottom w:color="ddd0f5" w:space="0" w:sz="4" w:val="single"/>
               <w:right w:color="ddd0f5" w:space="0" w:sz="4" w:val="single"/>
             </w:tcBorders>
-            <w:shd w:fill="ffffff" w:val="clear"/>
+            <w:shd w:fill="f5f0ff" w:val="clear"/>
             <w:tcMar>
               <w:top w:w="80.0" w:type="dxa"/>
               <w:left w:w="140.0" w:type="dxa"/>
@@ -10046,79 +10243,79 @@
               <w:bottom w:color="ddd0f5" w:space="0" w:sz="4" w:val="single"/>
               <w:right w:color="ddd0f5" w:space="0" w:sz="4" w:val="single"/>
             </w:tcBorders>
-            <w:shd w:fill="f5f0ff" w:val="clear"/>
-            <w:tcMar>
-              <w:top w:w="80.0" w:type="dxa"/>
-              <w:left w:w="140.0" w:type="dxa"/>
-              <w:bottom w:w="80.0" w:type="dxa"/>
-              <w:right w:w="140.0" w:type="dxa"/>
-            </w:tcMar>
-          </w:tcPr>
-          <w:p>
-            <w:pPr>
-              <w:rPr/>
-            </w:pPr>
-            <w:r>
-              <w:rPr>
-                <w:rFonts w:ascii="Arial" w:cs="Arial" w:eastAsia="Arial" w:hAnsi="Arial"/>
-                <w:sz w:val="20"/>
-                <w:szCs w:val="20"/>
-                <w:rtl w:val="0"/>
-              </w:rPr>
-              <w:t xml:space="preserve">/usuarios/:id/vincular_unidade</w:t>
-            </w:r>
-            <w:r>
-              <w:rPr>
-                <w:rtl w:val="0"/>
-              </w:rPr>
-            </w:r>
-          </w:p>
-        </w:tc>
-        <w:tc>
-          <w:tcPr>
-            <w:tcBorders>
-              <w:top w:color="ddd0f5" w:space="0" w:sz="4" w:val="single"/>
-              <w:left w:color="ddd0f5" w:space="0" w:sz="4" w:val="single"/>
-              <w:bottom w:color="ddd0f5" w:space="0" w:sz="4" w:val="single"/>
-              <w:right w:color="ddd0f5" w:space="0" w:sz="4" w:val="single"/>
-            </w:tcBorders>
-            <w:shd w:fill="f5f0ff" w:val="clear"/>
-            <w:tcMar>
-              <w:top w:w="80.0" w:type="dxa"/>
-              <w:left w:w="140.0" w:type="dxa"/>
-              <w:bottom w:w="80.0" w:type="dxa"/>
-              <w:right w:w="140.0" w:type="dxa"/>
-            </w:tcMar>
-          </w:tcPr>
-          <w:p>
-            <w:pPr>
-              <w:rPr/>
-            </w:pPr>
-            <w:r>
-              <w:rPr>
-                <w:rFonts w:ascii="Arial" w:cs="Arial" w:eastAsia="Arial" w:hAnsi="Arial"/>
-                <w:sz w:val="20"/>
-                <w:szCs w:val="20"/>
-                <w:rtl w:val="0"/>
-              </w:rPr>
-              <w:t xml:space="preserve">POST</w:t>
-            </w:r>
-            <w:r>
-              <w:rPr>
-                <w:rtl w:val="0"/>
-              </w:rPr>
-            </w:r>
-          </w:p>
-        </w:tc>
-        <w:tc>
-          <w:tcPr>
-            <w:tcBorders>
-              <w:top w:color="ddd0f5" w:space="0" w:sz="4" w:val="single"/>
-              <w:left w:color="ddd0f5" w:space="0" w:sz="4" w:val="single"/>
-              <w:bottom w:color="ddd0f5" w:space="0" w:sz="4" w:val="single"/>
-              <w:right w:color="ddd0f5" w:space="0" w:sz="4" w:val="single"/>
-            </w:tcBorders>
-            <w:shd w:fill="f5f0ff" w:val="clear"/>
+            <w:shd w:fill="ffffff" w:val="clear"/>
+            <w:tcMar>
+              <w:top w:w="80.0" w:type="dxa"/>
+              <w:left w:w="140.0" w:type="dxa"/>
+              <w:bottom w:w="80.0" w:type="dxa"/>
+              <w:right w:w="140.0" w:type="dxa"/>
+            </w:tcMar>
+          </w:tcPr>
+          <w:p>
+            <w:pPr>
+              <w:rPr/>
+            </w:pPr>
+            <w:r>
+              <w:rPr>
+                <w:rFonts w:ascii="Arial" w:cs="Arial" w:eastAsia="Arial" w:hAnsi="Arial"/>
+                <w:sz w:val="20"/>
+                <w:szCs w:val="20"/>
+                <w:rtl w:val="0"/>
+              </w:rPr>
+              <w:t xml:space="preserve">/usuarios</w:t>
+            </w:r>
+            <w:r>
+              <w:rPr>
+                <w:rtl w:val="0"/>
+              </w:rPr>
+            </w:r>
+          </w:p>
+        </w:tc>
+        <w:tc>
+          <w:tcPr>
+            <w:tcBorders>
+              <w:top w:color="ddd0f5" w:space="0" w:sz="4" w:val="single"/>
+              <w:left w:color="ddd0f5" w:space="0" w:sz="4" w:val="single"/>
+              <w:bottom w:color="ddd0f5" w:space="0" w:sz="4" w:val="single"/>
+              <w:right w:color="ddd0f5" w:space="0" w:sz="4" w:val="single"/>
+            </w:tcBorders>
+            <w:shd w:fill="ffffff" w:val="clear"/>
+            <w:tcMar>
+              <w:top w:w="80.0" w:type="dxa"/>
+              <w:left w:w="140.0" w:type="dxa"/>
+              <w:bottom w:w="80.0" w:type="dxa"/>
+              <w:right w:w="140.0" w:type="dxa"/>
+            </w:tcMar>
+          </w:tcPr>
+          <w:p>
+            <w:pPr>
+              <w:rPr/>
+            </w:pPr>
+            <w:r>
+              <w:rPr>
+                <w:rFonts w:ascii="Arial" w:cs="Arial" w:eastAsia="Arial" w:hAnsi="Arial"/>
+                <w:sz w:val="20"/>
+                <w:szCs w:val="20"/>
+                <w:rtl w:val="0"/>
+              </w:rPr>
+              <w:t xml:space="preserve">CRUD</w:t>
+            </w:r>
+            <w:r>
+              <w:rPr>
+                <w:rtl w:val="0"/>
+              </w:rPr>
+            </w:r>
+          </w:p>
+        </w:tc>
+        <w:tc>
+          <w:tcPr>
+            <w:tcBorders>
+              <w:top w:color="ddd0f5" w:space="0" w:sz="4" w:val="single"/>
+              <w:left w:color="ddd0f5" w:space="0" w:sz="4" w:val="single"/>
+              <w:bottom w:color="ddd0f5" w:space="0" w:sz="4" w:val="single"/>
+              <w:right w:color="ddd0f5" w:space="0" w:sz="4" w:val="single"/>
+            </w:tcBorders>
+            <w:shd w:fill="ffffff" w:val="clear"/>
             <w:tcMar>
               <w:top w:w="80.0" w:type="dxa"/>
               <w:left w:w="140.0" w:type="dxa"/>
@@ -10160,79 +10357,77 @@
               <w:bottom w:color="ddd0f5" w:space="0" w:sz="4" w:val="single"/>
               <w:right w:color="ddd0f5" w:space="0" w:sz="4" w:val="single"/>
             </w:tcBorders>
-            <w:shd w:fill="ffffff" w:val="clear"/>
-            <w:tcMar>
-              <w:top w:w="80.0" w:type="dxa"/>
-              <w:left w:w="140.0" w:type="dxa"/>
-              <w:bottom w:w="80.0" w:type="dxa"/>
-              <w:right w:w="140.0" w:type="dxa"/>
-            </w:tcMar>
-          </w:tcPr>
-          <w:p>
-            <w:pPr>
-              <w:rPr/>
-            </w:pPr>
-            <w:r>
-              <w:rPr>
-                <w:rFonts w:ascii="Arial" w:cs="Arial" w:eastAsia="Arial" w:hAnsi="Arial"/>
-                <w:sz w:val="20"/>
-                <w:szCs w:val="20"/>
-                <w:rtl w:val="0"/>
-              </w:rPr>
-              <w:t xml:space="preserve">/tipos_chamado</w:t>
-            </w:r>
-            <w:r>
-              <w:rPr>
-                <w:rtl w:val="0"/>
-              </w:rPr>
-            </w:r>
-          </w:p>
-        </w:tc>
-        <w:tc>
-          <w:tcPr>
-            <w:tcBorders>
-              <w:top w:color="ddd0f5" w:space="0" w:sz="4" w:val="single"/>
-              <w:left w:color="ddd0f5" w:space="0" w:sz="4" w:val="single"/>
-              <w:bottom w:color="ddd0f5" w:space="0" w:sz="4" w:val="single"/>
-              <w:right w:color="ddd0f5" w:space="0" w:sz="4" w:val="single"/>
-            </w:tcBorders>
-            <w:shd w:fill="ffffff" w:val="clear"/>
-            <w:tcMar>
-              <w:top w:w="80.0" w:type="dxa"/>
-              <w:left w:w="140.0" w:type="dxa"/>
-              <w:bottom w:w="80.0" w:type="dxa"/>
-              <w:right w:w="140.0" w:type="dxa"/>
-            </w:tcMar>
-          </w:tcPr>
-          <w:p>
-            <w:pPr>
-              <w:rPr/>
-            </w:pPr>
-            <w:r>
-              <w:rPr>
-                <w:rFonts w:ascii="Arial" w:cs="Arial" w:eastAsia="Arial" w:hAnsi="Arial"/>
-                <w:sz w:val="20"/>
-                <w:szCs w:val="20"/>
-                <w:rtl w:val="0"/>
-              </w:rPr>
-              <w:t xml:space="preserve">CRUD</w:t>
-            </w:r>
-            <w:r>
-              <w:rPr>
-                <w:rtl w:val="0"/>
-              </w:rPr>
-            </w:r>
-          </w:p>
-        </w:tc>
-        <w:tc>
-          <w:tcPr>
-            <w:tcBorders>
-              <w:top w:color="ddd0f5" w:space="0" w:sz="4" w:val="single"/>
-              <w:left w:color="ddd0f5" w:space="0" w:sz="4" w:val="single"/>
-              <w:bottom w:color="ddd0f5" w:space="0" w:sz="4" w:val="single"/>
-              <w:right w:color="ddd0f5" w:space="0" w:sz="4" w:val="single"/>
-            </w:tcBorders>
-            <w:shd w:fill="ffffff" w:val="clear"/>
+            <w:shd w:fill="f5f0ff" w:val="clear"/>
+            <w:tcMar>
+              <w:top w:w="80.0" w:type="dxa"/>
+              <w:left w:w="140.0" w:type="dxa"/>
+              <w:bottom w:w="80.0" w:type="dxa"/>
+              <w:right w:w="140.0" w:type="dxa"/>
+            </w:tcMar>
+          </w:tcPr>
+          <w:p>
+            <w:pPr>
+              <w:rPr/>
+            </w:pPr>
+            <w:r>
+              <w:rPr>
+                <w:sz w:val="20"/>
+                <w:szCs w:val="20"/>
+                <w:rtl w:val="0"/>
+              </w:rPr>
+              <w:t xml:space="preserve">/usuarios/:id/vincular_unidade, desvincular_unidade, vincular_tipo_chamado, desvincular_tipo_chamado</w:t>
+            </w:r>
+            <w:r>
+              <w:rPr>
+                <w:rtl w:val="0"/>
+              </w:rPr>
+            </w:r>
+          </w:p>
+        </w:tc>
+        <w:tc>
+          <w:tcPr>
+            <w:tcBorders>
+              <w:top w:color="ddd0f5" w:space="0" w:sz="4" w:val="single"/>
+              <w:left w:color="ddd0f5" w:space="0" w:sz="4" w:val="single"/>
+              <w:bottom w:color="ddd0f5" w:space="0" w:sz="4" w:val="single"/>
+              <w:right w:color="ddd0f5" w:space="0" w:sz="4" w:val="single"/>
+            </w:tcBorders>
+            <w:shd w:fill="f5f0ff" w:val="clear"/>
+            <w:tcMar>
+              <w:top w:w="80.0" w:type="dxa"/>
+              <w:left w:w="140.0" w:type="dxa"/>
+              <w:bottom w:w="80.0" w:type="dxa"/>
+              <w:right w:w="140.0" w:type="dxa"/>
+            </w:tcMar>
+          </w:tcPr>
+          <w:p>
+            <w:pPr>
+              <w:rPr/>
+            </w:pPr>
+            <w:r>
+              <w:rPr>
+                <w:sz w:val="20"/>
+                <w:szCs w:val="20"/>
+                <w:rtl w:val="0"/>
+              </w:rPr>
+              <w:t xml:space="preserve">POST/DELETE</w:t>
+            </w:r>
+            <w:r>
+              <w:rPr>
+                <w:rtl w:val="0"/>
+              </w:rPr>
+            </w:r>
+          </w:p>
+        </w:tc>
+        <w:tc>
+          <w:tcPr>
+            <w:tcBorders>
+              <w:top w:color="ddd0f5" w:space="0" w:sz="4" w:val="single"/>
+              <w:left w:color="ddd0f5" w:space="0" w:sz="4" w:val="single"/>
+              <w:bottom w:color="ddd0f5" w:space="0" w:sz="4" w:val="single"/>
+              <w:right w:color="ddd0f5" w:space="0" w:sz="4" w:val="single"/>
+            </w:tcBorders>
+            <w:shd w:fill="f5f0ff" w:val="clear"/>
             <w:tcMar>
               <w:top w:w="80.0" w:type="dxa"/>
               <w:left w:w="140.0" w:type="dxa"/>
@@ -10274,43 +10469,43 @@
               <w:bottom w:color="ddd0f5" w:space="0" w:sz="4" w:val="single"/>
               <w:right w:color="ddd0f5" w:space="0" w:sz="4" w:val="single"/>
             </w:tcBorders>
-            <w:shd w:fill="f5f0ff" w:val="clear"/>
-            <w:tcMar>
-              <w:top w:w="80.0" w:type="dxa"/>
-              <w:left w:w="140.0" w:type="dxa"/>
-              <w:bottom w:w="80.0" w:type="dxa"/>
-              <w:right w:w="140.0" w:type="dxa"/>
-            </w:tcMar>
-          </w:tcPr>
-          <w:p>
-            <w:pPr>
-              <w:rPr/>
-            </w:pPr>
-            <w:r>
-              <w:rPr>
-                <w:rFonts w:ascii="Arial" w:cs="Arial" w:eastAsia="Arial" w:hAnsi="Arial"/>
-                <w:sz w:val="20"/>
-                <w:szCs w:val="20"/>
-                <w:rtl w:val="0"/>
-              </w:rPr>
-              <w:t xml:space="preserve">/status_chamados</w:t>
-            </w:r>
-            <w:r>
-              <w:rPr>
-                <w:rtl w:val="0"/>
-              </w:rPr>
-            </w:r>
-          </w:p>
-        </w:tc>
-        <w:tc>
-          <w:tcPr>
-            <w:tcBorders>
-              <w:top w:color="ddd0f5" w:space="0" w:sz="4" w:val="single"/>
-              <w:left w:color="ddd0f5" w:space="0" w:sz="4" w:val="single"/>
-              <w:bottom w:color="ddd0f5" w:space="0" w:sz="4" w:val="single"/>
-              <w:right w:color="ddd0f5" w:space="0" w:sz="4" w:val="single"/>
-            </w:tcBorders>
-            <w:shd w:fill="f5f0ff" w:val="clear"/>
+            <w:shd w:fill="ffffff" w:val="clear"/>
+            <w:tcMar>
+              <w:top w:w="80.0" w:type="dxa"/>
+              <w:left w:w="140.0" w:type="dxa"/>
+              <w:bottom w:w="80.0" w:type="dxa"/>
+              <w:right w:w="140.0" w:type="dxa"/>
+            </w:tcMar>
+          </w:tcPr>
+          <w:p>
+            <w:pPr>
+              <w:rPr/>
+            </w:pPr>
+            <w:r>
+              <w:rPr>
+                <w:rFonts w:ascii="Arial" w:cs="Arial" w:eastAsia="Arial" w:hAnsi="Arial"/>
+                <w:sz w:val="20"/>
+                <w:szCs w:val="20"/>
+                <w:rtl w:val="0"/>
+              </w:rPr>
+              <w:t xml:space="preserve">/tipos_chamado</w:t>
+            </w:r>
+            <w:r>
+              <w:rPr>
+                <w:rtl w:val="0"/>
+              </w:rPr>
+            </w:r>
+          </w:p>
+        </w:tc>
+        <w:tc>
+          <w:tcPr>
+            <w:tcBorders>
+              <w:top w:color="ddd0f5" w:space="0" w:sz="4" w:val="single"/>
+              <w:left w:color="ddd0f5" w:space="0" w:sz="4" w:val="single"/>
+              <w:bottom w:color="ddd0f5" w:space="0" w:sz="4" w:val="single"/>
+              <w:right w:color="ddd0f5" w:space="0" w:sz="4" w:val="single"/>
+            </w:tcBorders>
+            <w:shd w:fill="ffffff" w:val="clear"/>
             <w:tcMar>
               <w:top w:w="80.0" w:type="dxa"/>
               <w:left w:w="140.0" w:type="dxa"/>
@@ -10346,7 +10541,7 @@
               <w:bottom w:color="ddd0f5" w:space="0" w:sz="4" w:val="single"/>
               <w:right w:color="ddd0f5" w:space="0" w:sz="4" w:val="single"/>
             </w:tcBorders>
-            <w:shd w:fill="f5f0ff" w:val="clear"/>
+            <w:shd w:fill="ffffff" w:val="clear"/>
             <w:tcMar>
               <w:top w:w="80.0" w:type="dxa"/>
               <w:left w:w="140.0" w:type="dxa"/>
@@ -10388,98 +10583,98 @@
               <w:bottom w:color="ddd0f5" w:space="0" w:sz="4" w:val="single"/>
               <w:right w:color="ddd0f5" w:space="0" w:sz="4" w:val="single"/>
             </w:tcBorders>
-            <w:shd w:fill="ffffff" w:val="clear"/>
-            <w:tcMar>
-              <w:top w:w="80.0" w:type="dxa"/>
-              <w:left w:w="140.0" w:type="dxa"/>
-              <w:bottom w:w="80.0" w:type="dxa"/>
-              <w:right w:w="140.0" w:type="dxa"/>
-            </w:tcMar>
-          </w:tcPr>
-          <w:p>
-            <w:pPr>
-              <w:rPr/>
-            </w:pPr>
-            <w:r>
-              <w:rPr>
-                <w:rFonts w:ascii="Arial" w:cs="Arial" w:eastAsia="Arial" w:hAnsi="Arial"/>
-                <w:sz w:val="20"/>
-                <w:szCs w:val="20"/>
-                <w:rtl w:val="0"/>
-              </w:rPr>
-              <w:t xml:space="preserve">/unidades</w:t>
-            </w:r>
-            <w:r>
-              <w:rPr>
-                <w:rtl w:val="0"/>
-              </w:rPr>
-            </w:r>
-          </w:p>
-        </w:tc>
-        <w:tc>
-          <w:tcPr>
-            <w:tcBorders>
-              <w:top w:color="ddd0f5" w:space="0" w:sz="4" w:val="single"/>
-              <w:left w:color="ddd0f5" w:space="0" w:sz="4" w:val="single"/>
-              <w:bottom w:color="ddd0f5" w:space="0" w:sz="4" w:val="single"/>
-              <w:right w:color="ddd0f5" w:space="0" w:sz="4" w:val="single"/>
-            </w:tcBorders>
-            <w:shd w:fill="ffffff" w:val="clear"/>
-            <w:tcMar>
-              <w:top w:w="80.0" w:type="dxa"/>
-              <w:left w:w="140.0" w:type="dxa"/>
-              <w:bottom w:w="80.0" w:type="dxa"/>
-              <w:right w:w="140.0" w:type="dxa"/>
-            </w:tcMar>
-          </w:tcPr>
-          <w:p>
-            <w:pPr>
-              <w:rPr/>
-            </w:pPr>
-            <w:r>
-              <w:rPr>
-                <w:rFonts w:ascii="Arial" w:cs="Arial" w:eastAsia="Arial" w:hAnsi="Arial"/>
-                <w:sz w:val="20"/>
-                <w:szCs w:val="20"/>
-                <w:rtl w:val="0"/>
-              </w:rPr>
-              <w:t xml:space="preserve">GET</w:t>
-            </w:r>
-            <w:r>
-              <w:rPr>
-                <w:rtl w:val="0"/>
-              </w:rPr>
-            </w:r>
-          </w:p>
-        </w:tc>
-        <w:tc>
-          <w:tcPr>
-            <w:tcBorders>
-              <w:top w:color="ddd0f5" w:space="0" w:sz="4" w:val="single"/>
-              <w:left w:color="ddd0f5" w:space="0" w:sz="4" w:val="single"/>
-              <w:bottom w:color="ddd0f5" w:space="0" w:sz="4" w:val="single"/>
-              <w:right w:color="ddd0f5" w:space="0" w:sz="4" w:val="single"/>
-            </w:tcBorders>
-            <w:shd w:fill="ffffff" w:val="clear"/>
-            <w:tcMar>
-              <w:top w:w="80.0" w:type="dxa"/>
-              <w:left w:w="140.0" w:type="dxa"/>
-              <w:bottom w:w="80.0" w:type="dxa"/>
-              <w:right w:w="140.0" w:type="dxa"/>
-            </w:tcMar>
-          </w:tcPr>
-          <w:p>
-            <w:pPr>
-              <w:rPr/>
-            </w:pPr>
-            <w:r>
-              <w:rPr>
-                <w:rFonts w:ascii="Arial" w:cs="Arial" w:eastAsia="Arial" w:hAnsi="Arial"/>
-                <w:sz w:val="20"/>
-                <w:szCs w:val="20"/>
-                <w:rtl w:val="0"/>
-              </w:rPr>
-              <w:t xml:space="preserve">Admin e colaborador</w:t>
+            <w:shd w:fill="f5f0ff" w:val="clear"/>
+            <w:tcMar>
+              <w:top w:w="80.0" w:type="dxa"/>
+              <w:left w:w="140.0" w:type="dxa"/>
+              <w:bottom w:w="80.0" w:type="dxa"/>
+              <w:right w:w="140.0" w:type="dxa"/>
+            </w:tcMar>
+          </w:tcPr>
+          <w:p>
+            <w:pPr>
+              <w:rPr/>
+            </w:pPr>
+            <w:r>
+              <w:rPr>
+                <w:rFonts w:ascii="Arial" w:cs="Arial" w:eastAsia="Arial" w:hAnsi="Arial"/>
+                <w:sz w:val="20"/>
+                <w:szCs w:val="20"/>
+                <w:rtl w:val="0"/>
+              </w:rPr>
+              <w:t xml:space="preserve">/status_chamados</w:t>
+            </w:r>
+            <w:r>
+              <w:rPr>
+                <w:rtl w:val="0"/>
+              </w:rPr>
+            </w:r>
+          </w:p>
+        </w:tc>
+        <w:tc>
+          <w:tcPr>
+            <w:tcBorders>
+              <w:top w:color="ddd0f5" w:space="0" w:sz="4" w:val="single"/>
+              <w:left w:color="ddd0f5" w:space="0" w:sz="4" w:val="single"/>
+              <w:bottom w:color="ddd0f5" w:space="0" w:sz="4" w:val="single"/>
+              <w:right w:color="ddd0f5" w:space="0" w:sz="4" w:val="single"/>
+            </w:tcBorders>
+            <w:shd w:fill="f5f0ff" w:val="clear"/>
+            <w:tcMar>
+              <w:top w:w="80.0" w:type="dxa"/>
+              <w:left w:w="140.0" w:type="dxa"/>
+              <w:bottom w:w="80.0" w:type="dxa"/>
+              <w:right w:w="140.0" w:type="dxa"/>
+            </w:tcMar>
+          </w:tcPr>
+          <w:p>
+            <w:pPr>
+              <w:rPr/>
+            </w:pPr>
+            <w:r>
+              <w:rPr>
+                <w:rFonts w:ascii="Arial" w:cs="Arial" w:eastAsia="Arial" w:hAnsi="Arial"/>
+                <w:sz w:val="20"/>
+                <w:szCs w:val="20"/>
+                <w:rtl w:val="0"/>
+              </w:rPr>
+              <w:t xml:space="preserve">CRUD</w:t>
+            </w:r>
+            <w:r>
+              <w:rPr>
+                <w:rtl w:val="0"/>
+              </w:rPr>
+            </w:r>
+          </w:p>
+        </w:tc>
+        <w:tc>
+          <w:tcPr>
+            <w:tcBorders>
+              <w:top w:color="ddd0f5" w:space="0" w:sz="4" w:val="single"/>
+              <w:left w:color="ddd0f5" w:space="0" w:sz="4" w:val="single"/>
+              <w:bottom w:color="ddd0f5" w:space="0" w:sz="4" w:val="single"/>
+              <w:right w:color="ddd0f5" w:space="0" w:sz="4" w:val="single"/>
+            </w:tcBorders>
+            <w:shd w:fill="f5f0ff" w:val="clear"/>
+            <w:tcMar>
+              <w:top w:w="80.0" w:type="dxa"/>
+              <w:left w:w="140.0" w:type="dxa"/>
+              <w:bottom w:w="80.0" w:type="dxa"/>
+              <w:right w:w="140.0" w:type="dxa"/>
+            </w:tcMar>
+          </w:tcPr>
+          <w:p>
+            <w:pPr>
+              <w:rPr/>
+            </w:pPr>
+            <w:r>
+              <w:rPr>
+                <w:rFonts w:ascii="Arial" w:cs="Arial" w:eastAsia="Arial" w:hAnsi="Arial"/>
+                <w:sz w:val="20"/>
+                <w:szCs w:val="20"/>
+                <w:rtl w:val="0"/>
+              </w:rPr>
+              <w:t xml:space="preserve">Somente administrador</w:t>
             </w:r>
             <w:r>
               <w:rPr>
@@ -10502,43 +10697,43 @@
               <w:bottom w:color="ddd0f5" w:space="0" w:sz="4" w:val="single"/>
               <w:right w:color="ddd0f5" w:space="0" w:sz="4" w:val="single"/>
             </w:tcBorders>
-            <w:shd w:fill="f5f0ff" w:val="clear"/>
-            <w:tcMar>
-              <w:top w:w="80.0" w:type="dxa"/>
-              <w:left w:w="140.0" w:type="dxa"/>
-              <w:bottom w:w="80.0" w:type="dxa"/>
-              <w:right w:w="140.0" w:type="dxa"/>
-            </w:tcMar>
-          </w:tcPr>
-          <w:p>
-            <w:pPr>
-              <w:rPr/>
-            </w:pPr>
-            <w:r>
-              <w:rPr>
-                <w:rFonts w:ascii="Arial" w:cs="Arial" w:eastAsia="Arial" w:hAnsi="Arial"/>
-                <w:sz w:val="20"/>
-                <w:szCs w:val="20"/>
-                <w:rtl w:val="0"/>
-              </w:rPr>
-              <w:t xml:space="preserve">/logs_auditoria</w:t>
-            </w:r>
-            <w:r>
-              <w:rPr>
-                <w:rtl w:val="0"/>
-              </w:rPr>
-            </w:r>
-          </w:p>
-        </w:tc>
-        <w:tc>
-          <w:tcPr>
-            <w:tcBorders>
-              <w:top w:color="ddd0f5" w:space="0" w:sz="4" w:val="single"/>
-              <w:left w:color="ddd0f5" w:space="0" w:sz="4" w:val="single"/>
-              <w:bottom w:color="ddd0f5" w:space="0" w:sz="4" w:val="single"/>
-              <w:right w:color="ddd0f5" w:space="0" w:sz="4" w:val="single"/>
-            </w:tcBorders>
-            <w:shd w:fill="f5f0ff" w:val="clear"/>
+            <w:shd w:fill="ffffff" w:val="clear"/>
+            <w:tcMar>
+              <w:top w:w="80.0" w:type="dxa"/>
+              <w:left w:w="140.0" w:type="dxa"/>
+              <w:bottom w:w="80.0" w:type="dxa"/>
+              <w:right w:w="140.0" w:type="dxa"/>
+            </w:tcMar>
+          </w:tcPr>
+          <w:p>
+            <w:pPr>
+              <w:rPr/>
+            </w:pPr>
+            <w:r>
+              <w:rPr>
+                <w:rFonts w:ascii="Arial" w:cs="Arial" w:eastAsia="Arial" w:hAnsi="Arial"/>
+                <w:sz w:val="20"/>
+                <w:szCs w:val="20"/>
+                <w:rtl w:val="0"/>
+              </w:rPr>
+              <w:t xml:space="preserve">/unidades</w:t>
+            </w:r>
+            <w:r>
+              <w:rPr>
+                <w:rtl w:val="0"/>
+              </w:rPr>
+            </w:r>
+          </w:p>
+        </w:tc>
+        <w:tc>
+          <w:tcPr>
+            <w:tcBorders>
+              <w:top w:color="ddd0f5" w:space="0" w:sz="4" w:val="single"/>
+              <w:left w:color="ddd0f5" w:space="0" w:sz="4" w:val="single"/>
+              <w:bottom w:color="ddd0f5" w:space="0" w:sz="4" w:val="single"/>
+              <w:right w:color="ddd0f5" w:space="0" w:sz="4" w:val="single"/>
+            </w:tcBorders>
+            <w:shd w:fill="ffffff" w:val="clear"/>
             <w:tcMar>
               <w:top w:w="80.0" w:type="dxa"/>
               <w:left w:w="140.0" w:type="dxa"/>
@@ -10574,26 +10769,26 @@
               <w:bottom w:color="ddd0f5" w:space="0" w:sz="4" w:val="single"/>
               <w:right w:color="ddd0f5" w:space="0" w:sz="4" w:val="single"/>
             </w:tcBorders>
-            <w:shd w:fill="f5f0ff" w:val="clear"/>
-            <w:tcMar>
-              <w:top w:w="80.0" w:type="dxa"/>
-              <w:left w:w="140.0" w:type="dxa"/>
-              <w:bottom w:w="80.0" w:type="dxa"/>
-              <w:right w:w="140.0" w:type="dxa"/>
-            </w:tcMar>
-          </w:tcPr>
-          <w:p>
-            <w:pPr>
-              <w:rPr/>
-            </w:pPr>
-            <w:r>
-              <w:rPr>
-                <w:rFonts w:ascii="Arial" w:cs="Arial" w:eastAsia="Arial" w:hAnsi="Arial"/>
-                <w:sz w:val="20"/>
-                <w:szCs w:val="20"/>
-                <w:rtl w:val="0"/>
-              </w:rPr>
-              <w:t xml:space="preserve">Somente administrador</w:t>
+            <w:shd w:fill="ffffff" w:val="clear"/>
+            <w:tcMar>
+              <w:top w:w="80.0" w:type="dxa"/>
+              <w:left w:w="140.0" w:type="dxa"/>
+              <w:bottom w:w="80.0" w:type="dxa"/>
+              <w:right w:w="140.0" w:type="dxa"/>
+            </w:tcMar>
+          </w:tcPr>
+          <w:p>
+            <w:pPr>
+              <w:rPr/>
+            </w:pPr>
+            <w:r>
+              <w:rPr>
+                <w:rFonts w:ascii="Arial" w:cs="Arial" w:eastAsia="Arial" w:hAnsi="Arial"/>
+                <w:sz w:val="20"/>
+                <w:szCs w:val="20"/>
+                <w:rtl w:val="0"/>
+              </w:rPr>
+              <w:t xml:space="preserve">Admin e colaborador</w:t>
             </w:r>
             <w:r>
               <w:rPr>
@@ -10616,98 +10811,98 @@
               <w:bottom w:color="ddd0f5" w:space="0" w:sz="4" w:val="single"/>
               <w:right w:color="ddd0f5" w:space="0" w:sz="4" w:val="single"/>
             </w:tcBorders>
-            <w:shd w:fill="ffffff" w:val="clear"/>
-            <w:tcMar>
-              <w:top w:w="80.0" w:type="dxa"/>
-              <w:left w:w="140.0" w:type="dxa"/>
-              <w:bottom w:w="80.0" w:type="dxa"/>
-              <w:right w:w="140.0" w:type="dxa"/>
-            </w:tcMar>
-          </w:tcPr>
-          <w:p>
-            <w:pPr>
-              <w:rPr/>
-            </w:pPr>
-            <w:r>
-              <w:rPr>
-                <w:rFonts w:ascii="Arial" w:cs="Arial" w:eastAsia="Arial" w:hAnsi="Arial"/>
-                <w:sz w:val="20"/>
-                <w:szCs w:val="20"/>
-                <w:rtl w:val="0"/>
-              </w:rPr>
-              <w:t xml:space="preserve">/users/sign_in</w:t>
-            </w:r>
-            <w:r>
-              <w:rPr>
-                <w:rtl w:val="0"/>
-              </w:rPr>
-            </w:r>
-          </w:p>
-        </w:tc>
-        <w:tc>
-          <w:tcPr>
-            <w:tcBorders>
-              <w:top w:color="ddd0f5" w:space="0" w:sz="4" w:val="single"/>
-              <w:left w:color="ddd0f5" w:space="0" w:sz="4" w:val="single"/>
-              <w:bottom w:color="ddd0f5" w:space="0" w:sz="4" w:val="single"/>
-              <w:right w:color="ddd0f5" w:space="0" w:sz="4" w:val="single"/>
-            </w:tcBorders>
-            <w:shd w:fill="ffffff" w:val="clear"/>
-            <w:tcMar>
-              <w:top w:w="80.0" w:type="dxa"/>
-              <w:left w:w="140.0" w:type="dxa"/>
-              <w:bottom w:w="80.0" w:type="dxa"/>
-              <w:right w:w="140.0" w:type="dxa"/>
-            </w:tcMar>
-          </w:tcPr>
-          <w:p>
-            <w:pPr>
-              <w:rPr/>
-            </w:pPr>
-            <w:r>
-              <w:rPr>
-                <w:rFonts w:ascii="Arial" w:cs="Arial" w:eastAsia="Arial" w:hAnsi="Arial"/>
-                <w:sz w:val="20"/>
-                <w:szCs w:val="20"/>
-                <w:rtl w:val="0"/>
-              </w:rPr>
-              <w:t xml:space="preserve">GET/POST</w:t>
-            </w:r>
-            <w:r>
-              <w:rPr>
-                <w:rtl w:val="0"/>
-              </w:rPr>
-            </w:r>
-          </w:p>
-        </w:tc>
-        <w:tc>
-          <w:tcPr>
-            <w:tcBorders>
-              <w:top w:color="ddd0f5" w:space="0" w:sz="4" w:val="single"/>
-              <w:left w:color="ddd0f5" w:space="0" w:sz="4" w:val="single"/>
-              <w:bottom w:color="ddd0f5" w:space="0" w:sz="4" w:val="single"/>
-              <w:right w:color="ddd0f5" w:space="0" w:sz="4" w:val="single"/>
-            </w:tcBorders>
-            <w:shd w:fill="ffffff" w:val="clear"/>
-            <w:tcMar>
-              <w:top w:w="80.0" w:type="dxa"/>
-              <w:left w:w="140.0" w:type="dxa"/>
-              <w:bottom w:w="80.0" w:type="dxa"/>
-              <w:right w:w="140.0" w:type="dxa"/>
-            </w:tcMar>
-          </w:tcPr>
-          <w:p>
-            <w:pPr>
-              <w:rPr/>
-            </w:pPr>
-            <w:r>
-              <w:rPr>
-                <w:rFonts w:ascii="Arial" w:cs="Arial" w:eastAsia="Arial" w:hAnsi="Arial"/>
-                <w:sz w:val="20"/>
-                <w:szCs w:val="20"/>
-                <w:rtl w:val="0"/>
-              </w:rPr>
-              <w:t xml:space="preserve">Público — página de login Devise</w:t>
+            <w:shd w:fill="f5f0ff" w:val="clear"/>
+            <w:tcMar>
+              <w:top w:w="80.0" w:type="dxa"/>
+              <w:left w:w="140.0" w:type="dxa"/>
+              <w:bottom w:w="80.0" w:type="dxa"/>
+              <w:right w:w="140.0" w:type="dxa"/>
+            </w:tcMar>
+          </w:tcPr>
+          <w:p>
+            <w:pPr>
+              <w:rPr/>
+            </w:pPr>
+            <w:r>
+              <w:rPr>
+                <w:rFonts w:ascii="Arial" w:cs="Arial" w:eastAsia="Arial" w:hAnsi="Arial"/>
+                <w:sz w:val="20"/>
+                <w:szCs w:val="20"/>
+                <w:rtl w:val="0"/>
+              </w:rPr>
+              <w:t xml:space="preserve">/logs_auditoria</w:t>
+            </w:r>
+            <w:r>
+              <w:rPr>
+                <w:rtl w:val="0"/>
+              </w:rPr>
+            </w:r>
+          </w:p>
+        </w:tc>
+        <w:tc>
+          <w:tcPr>
+            <w:tcBorders>
+              <w:top w:color="ddd0f5" w:space="0" w:sz="4" w:val="single"/>
+              <w:left w:color="ddd0f5" w:space="0" w:sz="4" w:val="single"/>
+              <w:bottom w:color="ddd0f5" w:space="0" w:sz="4" w:val="single"/>
+              <w:right w:color="ddd0f5" w:space="0" w:sz="4" w:val="single"/>
+            </w:tcBorders>
+            <w:shd w:fill="f5f0ff" w:val="clear"/>
+            <w:tcMar>
+              <w:top w:w="80.0" w:type="dxa"/>
+              <w:left w:w="140.0" w:type="dxa"/>
+              <w:bottom w:w="80.0" w:type="dxa"/>
+              <w:right w:w="140.0" w:type="dxa"/>
+            </w:tcMar>
+          </w:tcPr>
+          <w:p>
+            <w:pPr>
+              <w:rPr/>
+            </w:pPr>
+            <w:r>
+              <w:rPr>
+                <w:rFonts w:ascii="Arial" w:cs="Arial" w:eastAsia="Arial" w:hAnsi="Arial"/>
+                <w:sz w:val="20"/>
+                <w:szCs w:val="20"/>
+                <w:rtl w:val="0"/>
+              </w:rPr>
+              <w:t xml:space="preserve">GET</w:t>
+            </w:r>
+            <w:r>
+              <w:rPr>
+                <w:rtl w:val="0"/>
+              </w:rPr>
+            </w:r>
+          </w:p>
+        </w:tc>
+        <w:tc>
+          <w:tcPr>
+            <w:tcBorders>
+              <w:top w:color="ddd0f5" w:space="0" w:sz="4" w:val="single"/>
+              <w:left w:color="ddd0f5" w:space="0" w:sz="4" w:val="single"/>
+              <w:bottom w:color="ddd0f5" w:space="0" w:sz="4" w:val="single"/>
+              <w:right w:color="ddd0f5" w:space="0" w:sz="4" w:val="single"/>
+            </w:tcBorders>
+            <w:shd w:fill="f5f0ff" w:val="clear"/>
+            <w:tcMar>
+              <w:top w:w="80.0" w:type="dxa"/>
+              <w:left w:w="140.0" w:type="dxa"/>
+              <w:bottom w:w="80.0" w:type="dxa"/>
+              <w:right w:w="140.0" w:type="dxa"/>
+            </w:tcMar>
+          </w:tcPr>
+          <w:p>
+            <w:pPr>
+              <w:rPr/>
+            </w:pPr>
+            <w:r>
+              <w:rPr>
+                <w:rFonts w:ascii="Arial" w:cs="Arial" w:eastAsia="Arial" w:hAnsi="Arial"/>
+                <w:sz w:val="20"/>
+                <w:szCs w:val="20"/>
+                <w:rtl w:val="0"/>
+              </w:rPr>
+              <w:t xml:space="preserve">Somente administrador</w:t>
             </w:r>
             <w:r>
               <w:rPr>
@@ -10730,6 +10925,120 @@
               <w:bottom w:color="ddd0f5" w:space="0" w:sz="4" w:val="single"/>
               <w:right w:color="ddd0f5" w:space="0" w:sz="4" w:val="single"/>
             </w:tcBorders>
+            <w:shd w:fill="ffffff" w:val="clear"/>
+            <w:tcMar>
+              <w:top w:w="80.0" w:type="dxa"/>
+              <w:left w:w="140.0" w:type="dxa"/>
+              <w:bottom w:w="80.0" w:type="dxa"/>
+              <w:right w:w="140.0" w:type="dxa"/>
+            </w:tcMar>
+          </w:tcPr>
+          <w:p>
+            <w:pPr>
+              <w:rPr/>
+            </w:pPr>
+            <w:r>
+              <w:rPr>
+                <w:rFonts w:ascii="Arial" w:cs="Arial" w:eastAsia="Arial" w:hAnsi="Arial"/>
+                <w:sz w:val="20"/>
+                <w:szCs w:val="20"/>
+                <w:rtl w:val="0"/>
+              </w:rPr>
+              <w:t xml:space="preserve">/users/sign_in</w:t>
+            </w:r>
+            <w:r>
+              <w:rPr>
+                <w:rtl w:val="0"/>
+              </w:rPr>
+            </w:r>
+          </w:p>
+        </w:tc>
+        <w:tc>
+          <w:tcPr>
+            <w:tcBorders>
+              <w:top w:color="ddd0f5" w:space="0" w:sz="4" w:val="single"/>
+              <w:left w:color="ddd0f5" w:space="0" w:sz="4" w:val="single"/>
+              <w:bottom w:color="ddd0f5" w:space="0" w:sz="4" w:val="single"/>
+              <w:right w:color="ddd0f5" w:space="0" w:sz="4" w:val="single"/>
+            </w:tcBorders>
+            <w:shd w:fill="ffffff" w:val="clear"/>
+            <w:tcMar>
+              <w:top w:w="80.0" w:type="dxa"/>
+              <w:left w:w="140.0" w:type="dxa"/>
+              <w:bottom w:w="80.0" w:type="dxa"/>
+              <w:right w:w="140.0" w:type="dxa"/>
+            </w:tcMar>
+          </w:tcPr>
+          <w:p>
+            <w:pPr>
+              <w:rPr/>
+            </w:pPr>
+            <w:r>
+              <w:rPr>
+                <w:rFonts w:ascii="Arial" w:cs="Arial" w:eastAsia="Arial" w:hAnsi="Arial"/>
+                <w:sz w:val="20"/>
+                <w:szCs w:val="20"/>
+                <w:rtl w:val="0"/>
+              </w:rPr>
+              <w:t xml:space="preserve">GET/POST</w:t>
+            </w:r>
+            <w:r>
+              <w:rPr>
+                <w:rtl w:val="0"/>
+              </w:rPr>
+            </w:r>
+          </w:p>
+        </w:tc>
+        <w:tc>
+          <w:tcPr>
+            <w:tcBorders>
+              <w:top w:color="ddd0f5" w:space="0" w:sz="4" w:val="single"/>
+              <w:left w:color="ddd0f5" w:space="0" w:sz="4" w:val="single"/>
+              <w:bottom w:color="ddd0f5" w:space="0" w:sz="4" w:val="single"/>
+              <w:right w:color="ddd0f5" w:space="0" w:sz="4" w:val="single"/>
+            </w:tcBorders>
+            <w:shd w:fill="ffffff" w:val="clear"/>
+            <w:tcMar>
+              <w:top w:w="80.0" w:type="dxa"/>
+              <w:left w:w="140.0" w:type="dxa"/>
+              <w:bottom w:w="80.0" w:type="dxa"/>
+              <w:right w:w="140.0" w:type="dxa"/>
+            </w:tcMar>
+          </w:tcPr>
+          <w:p>
+            <w:pPr>
+              <w:rPr/>
+            </w:pPr>
+            <w:r>
+              <w:rPr>
+                <w:rFonts w:ascii="Arial" w:cs="Arial" w:eastAsia="Arial" w:hAnsi="Arial"/>
+                <w:sz w:val="20"/>
+                <w:szCs w:val="20"/>
+                <w:rtl w:val="0"/>
+              </w:rPr>
+              <w:t xml:space="preserve">Público — página de login Devise</w:t>
+            </w:r>
+            <w:r>
+              <w:rPr>
+                <w:rtl w:val="0"/>
+              </w:rPr>
+            </w:r>
+          </w:p>
+        </w:tc>
+      </w:tr>
+      <w:tr>
+        <w:trPr>
+          <w:cantSplit w:val="0"/>
+          <w:tblHeader w:val="0"/>
+        </w:trPr>
+        <w:tc>
+          <w:tcPr>
+            <w:tcBorders>
+              <w:top w:color="ddd0f5" w:space="0" w:sz="4" w:val="single"/>
+              <w:left w:color="ddd0f5" w:space="0" w:sz="4" w:val="single"/>
+              <w:bottom w:color="ddd0f5" w:space="0" w:sz="4" w:val="single"/>
+              <w:right w:color="ddd0f5" w:space="0" w:sz="4" w:val="single"/>
+            </w:tcBorders>
             <w:shd w:fill="f5f0ff" w:val="clear"/>
             <w:tcMar>
               <w:top w:w="80.0" w:type="dxa"/>
@@ -10914,6 +11223,7 @@
     <w:p>
       <w:pPr>
         <w:spacing w:after="120" w:lineRule="auto"/>
+        <w:jc w:val="both"/>
         <w:rPr/>
       </w:pPr>
       <w:r>
@@ -10951,7 +11261,7 @@
         <w:shd w:fill="auto" w:val="clear"/>
         <w:spacing w:after="80" w:before="0" w:line="240" w:lineRule="auto"/>
         <w:ind w:left="720" w:right="0" w:hanging="360"/>
-        <w:jc w:val="left"/>
+        <w:jc w:val="both"/>
         <w:rPr/>
       </w:pPr>
       <w:r>
@@ -10994,7 +11304,7 @@
         <w:shd w:fill="auto" w:val="clear"/>
         <w:spacing w:after="80" w:before="0" w:line="240" w:lineRule="auto"/>
         <w:ind w:left="720" w:right="0" w:hanging="360"/>
-        <w:jc w:val="left"/>
+        <w:jc w:val="both"/>
         <w:rPr/>
       </w:pPr>
       <w:r>
@@ -11037,7 +11347,7 @@
         <w:shd w:fill="auto" w:val="clear"/>
         <w:spacing w:after="80" w:before="0" w:line="240" w:lineRule="auto"/>
         <w:ind w:left="720" w:right="0" w:hanging="360"/>
-        <w:jc w:val="left"/>
+        <w:jc w:val="both"/>
         <w:rPr/>
       </w:pPr>
       <w:r>
@@ -11080,7 +11390,7 @@
         <w:shd w:fill="auto" w:val="clear"/>
         <w:spacing w:after="80" w:before="0" w:line="240" w:lineRule="auto"/>
         <w:ind w:left="720" w:right="0" w:hanging="360"/>
-        <w:jc w:val="left"/>
+        <w:jc w:val="both"/>
         <w:rPr/>
       </w:pPr>
       <w:r>
@@ -11123,7 +11433,7 @@
         <w:shd w:fill="auto" w:val="clear"/>
         <w:spacing w:after="80" w:before="0" w:line="240" w:lineRule="auto"/>
         <w:ind w:left="720" w:right="0" w:hanging="360"/>
-        <w:jc w:val="left"/>
+        <w:jc w:val="both"/>
         <w:rPr/>
       </w:pPr>
       <w:r>
@@ -11166,7 +11476,7 @@
         <w:shd w:fill="auto" w:val="clear"/>
         <w:spacing w:after="80" w:before="0" w:line="240" w:lineRule="auto"/>
         <w:ind w:left="720" w:right="0" w:hanging="360"/>
-        <w:jc w:val="left"/>
+        <w:jc w:val="both"/>
         <w:rPr/>
       </w:pPr>
       <w:r>
@@ -11225,6 +11535,7 @@
     <w:p>
       <w:pPr>
         <w:spacing w:after="120" w:lineRule="auto"/>
+        <w:jc w:val="both"/>
         <w:rPr/>
       </w:pPr>
       <w:r>
@@ -11262,7 +11573,7 @@
         <w:shd w:fill="auto" w:val="clear"/>
         <w:spacing w:after="80" w:before="0" w:line="240" w:lineRule="auto"/>
         <w:ind w:left="720" w:right="0" w:hanging="360"/>
-        <w:jc w:val="left"/>
+        <w:jc w:val="both"/>
         <w:rPr/>
       </w:pPr>
       <w:r>
@@ -11305,7 +11616,7 @@
         <w:shd w:fill="auto" w:val="clear"/>
         <w:spacing w:after="80" w:before="0" w:line="240" w:lineRule="auto"/>
         <w:ind w:left="720" w:right="0" w:hanging="360"/>
-        <w:jc w:val="left"/>
+        <w:jc w:val="both"/>
         <w:rPr/>
       </w:pPr>
       <w:r>
@@ -11348,7 +11659,7 @@
         <w:shd w:fill="auto" w:val="clear"/>
         <w:spacing w:after="80" w:before="0" w:line="240" w:lineRule="auto"/>
         <w:ind w:left="720" w:right="0" w:hanging="360"/>
-        <w:jc w:val="left"/>
+        <w:jc w:val="both"/>
         <w:rPr/>
       </w:pPr>
       <w:r>
@@ -11391,7 +11702,7 @@
         <w:shd w:fill="auto" w:val="clear"/>
         <w:spacing w:after="80" w:before="0" w:line="240" w:lineRule="auto"/>
         <w:ind w:left="720" w:right="0" w:hanging="360"/>
-        <w:jc w:val="left"/>
+        <w:jc w:val="both"/>
         <w:rPr/>
       </w:pPr>
       <w:r>
@@ -11412,6 +11723,60 @@
           <w:rtl w:val="0"/>
         </w:rPr>
         <w:t xml:space="preserve">Não pode abrir chamados nem acessar configurações do sistema</w:t>
+      </w:r>
+    </w:p>
+    <w:p>
+      <w:pPr>
+        <w:rPr/>
+      </w:pPr>
+      <w:r>
+        <w:rPr>
+          <w:rtl w:val="0"/>
+        </w:rPr>
+      </w:r>
+    </w:p>
+    <w:p>
+      <w:pPr>
+        <w:pStyle w:val="Heading2"/>
+        <w:rPr/>
+      </w:pPr>
+      <w:r>
+        <w:rPr>
+          <w:rFonts w:ascii="Arial" w:cs="Arial" w:eastAsia="Arial" w:hAnsi="Arial"/>
+          <w:b w:val="1"/>
+          <w:bCs w:val="1"/>
+          <w:color w:val="5b21b6"/>
+          <w:sz w:val="26"/>
+          <w:szCs w:val="26"/>
+          <w:rtl w:val="0"/>
+        </w:rPr>
+        <w:t xml:space="preserve">6.3 Morador</w:t>
+      </w:r>
+      <w:r>
+        <w:rPr>
+          <w:rtl w:val="0"/>
+        </w:rPr>
+      </w:r>
+    </w:p>
+    <w:p>
+      <w:pPr>
+        <w:spacing w:after="120" w:lineRule="auto"/>
+        <w:jc w:val="both"/>
+        <w:rPr/>
+      </w:pPr>
+      <w:r>
+        <w:rPr>
+          <w:rFonts w:ascii="Arial" w:cs="Arial" w:eastAsia="Arial" w:hAnsi="Arial"/>
+          <w:sz w:val="22"/>
+          <w:szCs w:val="22"/>
+          <w:rtl w:val="0"/>
+        </w:rPr>
+        <w:t xml:space="preserve">Usuário final do sistema. Interage apenas com chamados das suas unidades.</w:t>
+      </w:r>
+      <w:r>
+        <w:rPr>
+          <w:rtl w:val="0"/>
+        </w:rPr>
       </w:r>
     </w:p>
     <w:p>
@@ -11434,69 +11799,27 @@
         <w:shd w:fill="auto" w:val="clear"/>
         <w:spacing w:after="80" w:before="0" w:line="240" w:lineRule="auto"/>
         <w:ind w:left="720" w:right="0" w:hanging="360"/>
-        <w:jc w:val="left"/>
-        <w:rPr>
-          <w:u w:val="none"/>
-        </w:rPr>
-      </w:pPr>
-      <w:r>
-        <w:rPr>
-          <w:rtl w:val="0"/>
-        </w:rPr>
-        <w:t xml:space="preserve">Visualiza o prazo máximo de resolução (SLA) calculado na listagem de chamados</w:t>
-      </w:r>
-    </w:p>
-    <w:p>
-      <w:pPr>
-        <w:rPr/>
-      </w:pPr>
-      <w:r>
-        <w:rPr>
-          <w:rtl w:val="0"/>
-        </w:rPr>
-      </w:r>
-    </w:p>
-    <w:p>
-      <w:pPr>
-        <w:pStyle w:val="Heading2"/>
+        <w:jc w:val="both"/>
         <w:rPr/>
       </w:pPr>
       <w:r>
         <w:rPr>
           <w:rFonts w:ascii="Arial" w:cs="Arial" w:eastAsia="Arial" w:hAnsi="Arial"/>
-          <w:b w:val="1"/>
-          <w:bCs w:val="1"/>
-          <w:color w:val="5b21b6"/>
-          <w:sz w:val="26"/>
-          <w:szCs w:val="26"/>
-          <w:rtl w:val="0"/>
-        </w:rPr>
-        <w:t xml:space="preserve">6.3 Morador</w:t>
-      </w:r>
-      <w:r>
-        <w:rPr>
-          <w:rtl w:val="0"/>
-        </w:rPr>
-      </w:r>
-    </w:p>
-    <w:p>
-      <w:pPr>
-        <w:spacing w:after="120" w:lineRule="auto"/>
-        <w:rPr/>
-      </w:pPr>
-      <w:r>
-        <w:rPr>
-          <w:rFonts w:ascii="Arial" w:cs="Arial" w:eastAsia="Arial" w:hAnsi="Arial"/>
+          <w:b w:val="0"/>
+          <w:bCs w:val="0"/>
+          <w:i w:val="0"/>
+          <w:iCs w:val="0"/>
+          <w:smallCaps w:val="0"/>
+          <w:strike w:val="0"/>
+          <w:color w:val="000000"/>
           <w:sz w:val="22"/>
           <w:szCs w:val="22"/>
-          <w:rtl w:val="0"/>
-        </w:rPr>
-        <w:t xml:space="preserve">Usuário final do sistema. Interage apenas com chamados das suas unidades.</w:t>
-      </w:r>
-      <w:r>
-        <w:rPr>
-          <w:rtl w:val="0"/>
-        </w:rPr>
+          <w:u w:val="none"/>
+          <w:shd w:fill="auto" w:val="clear"/>
+          <w:vertAlign w:val="baseline"/>
+          <w:rtl w:val="0"/>
+        </w:rPr>
+        <w:t xml:space="preserve">Abre chamados selecionando uma das suas unidades vinculadas</w:t>
       </w:r>
     </w:p>
     <w:p>
@@ -11519,7 +11842,7 @@
         <w:shd w:fill="auto" w:val="clear"/>
         <w:spacing w:after="80" w:before="0" w:line="240" w:lineRule="auto"/>
         <w:ind w:left="720" w:right="0" w:hanging="360"/>
-        <w:jc w:val="left"/>
+        <w:jc w:val="both"/>
         <w:rPr/>
       </w:pPr>
       <w:r>
@@ -11539,7 +11862,7 @@
           <w:vertAlign w:val="baseline"/>
           <w:rtl w:val="0"/>
         </w:rPr>
-        <w:t xml:space="preserve">Abre chamados selecionando uma das suas unidades vinculadas</w:t>
+        <w:t xml:space="preserve">Vê apenas chamados das suas próprias unidades</w:t>
       </w:r>
     </w:p>
     <w:p>
@@ -11562,7 +11885,7 @@
         <w:shd w:fill="auto" w:val="clear"/>
         <w:spacing w:after="80" w:before="0" w:line="240" w:lineRule="auto"/>
         <w:ind w:left="720" w:right="0" w:hanging="360"/>
-        <w:jc w:val="left"/>
+        <w:jc w:val="both"/>
         <w:rPr/>
       </w:pPr>
       <w:r>
@@ -11582,7 +11905,7 @@
           <w:vertAlign w:val="baseline"/>
           <w:rtl w:val="0"/>
         </w:rPr>
-        <w:t xml:space="preserve">Vê apenas chamados das suas próprias unidades</w:t>
+        <w:t xml:space="preserve">Comenta somente nos chamados das suas unidades</w:t>
       </w:r>
     </w:p>
     <w:p>
@@ -11605,50 +11928,7 @@
         <w:shd w:fill="auto" w:val="clear"/>
         <w:spacing w:after="80" w:before="0" w:line="240" w:lineRule="auto"/>
         <w:ind w:left="720" w:right="0" w:hanging="360"/>
-        <w:jc w:val="left"/>
-        <w:rPr/>
-      </w:pPr>
-      <w:r>
-        <w:rPr>
-          <w:rFonts w:ascii="Arial" w:cs="Arial" w:eastAsia="Arial" w:hAnsi="Arial"/>
-          <w:b w:val="0"/>
-          <w:bCs w:val="0"/>
-          <w:i w:val="0"/>
-          <w:iCs w:val="0"/>
-          <w:smallCaps w:val="0"/>
-          <w:strike w:val="0"/>
-          <w:color w:val="000000"/>
-          <w:sz w:val="22"/>
-          <w:szCs w:val="22"/>
-          <w:u w:val="none"/>
-          <w:shd w:fill="auto" w:val="clear"/>
-          <w:vertAlign w:val="baseline"/>
-          <w:rtl w:val="0"/>
-        </w:rPr>
-        <w:t xml:space="preserve">Comenta somente nos chamados das suas unidades</w:t>
-      </w:r>
-    </w:p>
-    <w:p>
-      <w:pPr>
-        <w:keepNext w:val="0"/>
-        <w:keepLines w:val="0"/>
-        <w:pageBreakBefore w:val="0"/>
-        <w:widowControl w:val="1"/>
-        <w:numPr>
-          <w:ilvl w:val="0"/>
-          <w:numId w:val="1"/>
-        </w:numPr>
-        <w:pBdr>
-          <w:top w:space="0" w:sz="0" w:val="nil"/>
-          <w:left w:space="0" w:sz="0" w:val="nil"/>
-          <w:bottom w:space="0" w:sz="0" w:val="nil"/>
-          <w:right w:space="0" w:sz="0" w:val="nil"/>
-          <w:between w:space="0" w:sz="0" w:val="nil"/>
-        </w:pBdr>
-        <w:shd w:fill="auto" w:val="clear"/>
-        <w:spacing w:after="80" w:before="0" w:line="240" w:lineRule="auto"/>
-        <w:ind w:left="720" w:right="0" w:hanging="360"/>
-        <w:jc w:val="left"/>
+        <w:jc w:val="both"/>
         <w:rPr/>
       </w:pPr>
       <w:r>
@@ -13019,12 +13299,11 @@
             </w:pPr>
             <w:r>
               <w:rPr>
-                <w:rFonts w:ascii="Arial" w:cs="Arial" w:eastAsia="Arial" w:hAnsi="Arial"/>
-                <w:sz w:val="20"/>
-                <w:szCs w:val="20"/>
-                <w:rtl w:val="0"/>
-              </w:rPr>
-              <w:t xml:space="preserve">Sim</w:t>
+                <w:sz w:val="20"/>
+                <w:szCs w:val="20"/>
+                <w:rtl w:val="0"/>
+              </w:rPr>
+              <w:t xml:space="preserve">Não</w:t>
             </w:r>
             <w:r>
               <w:rPr>
@@ -13214,6 +13493,14 @@
             </w:r>
             <w:r>
               <w:rPr>
+                <w:sz w:val="20"/>
+                <w:szCs w:val="20"/>
+                <w:rtl w:val="0"/>
+              </w:rPr>
+              <w:t xml:space="preserve">*</w:t>
+            </w:r>
+            <w:r>
+              <w:rPr>
                 <w:rtl w:val="0"/>
               </w:rPr>
             </w:r>
@@ -13469,12 +13756,11 @@
             </w:pPr>
             <w:r>
               <w:rPr>
-                <w:rFonts w:ascii="Arial" w:cs="Arial" w:eastAsia="Arial" w:hAnsi="Arial"/>
-                <w:sz w:val="20"/>
-                <w:szCs w:val="20"/>
-                <w:rtl w:val="0"/>
-              </w:rPr>
-              <w:t xml:space="preserve">Sim</w:t>
+                <w:sz w:val="20"/>
+                <w:szCs w:val="20"/>
+                <w:rtl w:val="0"/>
+              </w:rPr>
+              <w:t xml:space="preserve">Não</w:t>
             </w:r>
             <w:r>
               <w:rPr>
@@ -13505,12 +13791,11 @@
             </w:pPr>
             <w:r>
               <w:rPr>
-                <w:rFonts w:ascii="Arial" w:cs="Arial" w:eastAsia="Arial" w:hAnsi="Arial"/>
-                <w:sz w:val="20"/>
-                <w:szCs w:val="20"/>
-                <w:rtl w:val="0"/>
-              </w:rPr>
-              <w:t xml:space="preserve">Sim</w:t>
+                <w:sz w:val="20"/>
+                <w:szCs w:val="20"/>
+                <w:rtl w:val="0"/>
+              </w:rPr>
+              <w:t xml:space="preserve">Não</w:t>
             </w:r>
             <w:r>
               <w:rPr>
@@ -13729,18 +14014,21 @@
           </w:tcPr>
           <w:p>
             <w:pPr>
-              <w:rPr>
-                <w:sz w:val="20"/>
-                <w:szCs w:val="20"/>
-              </w:rPr>
-            </w:pPr>
-            <w:r>
-              <w:rPr>
-                <w:sz w:val="20"/>
-                <w:szCs w:val="20"/>
-                <w:rtl w:val="0"/>
-              </w:rPr>
-              <w:t xml:space="preserve">Ver prazo SLA dos chamados</w:t>
+              <w:rPr/>
+            </w:pPr>
+            <w:r>
+              <w:rPr>
+                <w:rFonts w:ascii="Arial" w:cs="Arial" w:eastAsia="Arial" w:hAnsi="Arial"/>
+                <w:sz w:val="20"/>
+                <w:szCs w:val="20"/>
+                <w:rtl w:val="0"/>
+              </w:rPr>
+              <w:t xml:space="preserve">Remover anexo de chamado</w:t>
+            </w:r>
+            <w:r>
+              <w:rPr>
+                <w:rtl w:val="0"/>
+              </w:rPr>
             </w:r>
           </w:p>
         </w:tc>
@@ -13762,11 +14050,7 @@
           </w:tcPr>
           <w:p>
             <w:pPr>
-              <w:rPr>
-                <w:rFonts w:ascii="Arial" w:cs="Arial" w:eastAsia="Arial" w:hAnsi="Arial"/>
-                <w:sz w:val="20"/>
-                <w:szCs w:val="20"/>
-              </w:rPr>
+              <w:rPr/>
             </w:pPr>
             <w:r>
               <w:rPr>
@@ -13801,58 +14085,52 @@
           </w:tcPr>
           <w:p>
             <w:pPr>
-              <w:rPr>
-                <w:rFonts w:ascii="Arial" w:cs="Arial" w:eastAsia="Arial" w:hAnsi="Arial"/>
-                <w:sz w:val="20"/>
-                <w:szCs w:val="20"/>
-              </w:rPr>
-            </w:pPr>
-            <w:r>
-              <w:rPr>
+              <w:rPr/>
+            </w:pPr>
+            <w:r>
+              <w:rPr>
+                <w:rFonts w:ascii="Arial" w:cs="Arial" w:eastAsia="Arial" w:hAnsi="Arial"/>
+                <w:sz w:val="20"/>
+                <w:szCs w:val="20"/>
+                <w:rtl w:val="0"/>
+              </w:rPr>
+              <w:t xml:space="preserve">Não</w:t>
+            </w:r>
+            <w:r>
+              <w:rPr>
+                <w:rtl w:val="0"/>
+              </w:rPr>
+            </w:r>
+          </w:p>
+        </w:tc>
+        <w:tc>
+          <w:tcPr>
+            <w:tcBorders>
+              <w:top w:color="ddd0f5" w:space="0" w:sz="4" w:val="single"/>
+              <w:left w:color="ddd0f5" w:space="0" w:sz="4" w:val="single"/>
+              <w:bottom w:color="ddd0f5" w:space="0" w:sz="4" w:val="single"/>
+              <w:right w:color="ddd0f5" w:space="0" w:sz="4" w:val="single"/>
+            </w:tcBorders>
+            <w:shd w:fill="f5f0ff" w:val="clear"/>
+            <w:tcMar>
+              <w:top w:w="80.0" w:type="dxa"/>
+              <w:left w:w="140.0" w:type="dxa"/>
+              <w:bottom w:w="80.0" w:type="dxa"/>
+              <w:right w:w="140.0" w:type="dxa"/>
+            </w:tcMar>
+          </w:tcPr>
+          <w:p>
+            <w:pPr>
+              <w:rPr/>
+            </w:pPr>
+            <w:r>
+              <w:rPr>
+                <w:rFonts w:ascii="Arial" w:cs="Arial" w:eastAsia="Arial" w:hAnsi="Arial"/>
                 <w:sz w:val="20"/>
                 <w:szCs w:val="20"/>
                 <w:rtl w:val="0"/>
               </w:rPr>
               <w:t xml:space="preserve">Sim</w:t>
-            </w:r>
-            <w:r>
-              <w:rPr>
-                <w:rtl w:val="0"/>
-              </w:rPr>
-            </w:r>
-          </w:p>
-        </w:tc>
-        <w:tc>
-          <w:tcPr>
-            <w:tcBorders>
-              <w:top w:color="ddd0f5" w:space="0" w:sz="4" w:val="single"/>
-              <w:left w:color="ddd0f5" w:space="0" w:sz="4" w:val="single"/>
-              <w:bottom w:color="ddd0f5" w:space="0" w:sz="4" w:val="single"/>
-              <w:right w:color="ddd0f5" w:space="0" w:sz="4" w:val="single"/>
-            </w:tcBorders>
-            <w:shd w:fill="f5f0ff" w:val="clear"/>
-            <w:tcMar>
-              <w:top w:w="80.0" w:type="dxa"/>
-              <w:left w:w="140.0" w:type="dxa"/>
-              <w:bottom w:w="80.0" w:type="dxa"/>
-              <w:right w:w="140.0" w:type="dxa"/>
-            </w:tcMar>
-          </w:tcPr>
-          <w:p>
-            <w:pPr>
-              <w:rPr>
-                <w:rFonts w:ascii="Arial" w:cs="Arial" w:eastAsia="Arial" w:hAnsi="Arial"/>
-                <w:sz w:val="20"/>
-                <w:szCs w:val="20"/>
-              </w:rPr>
-            </w:pPr>
-            <w:r>
-              <w:rPr>
-                <w:sz w:val="20"/>
-                <w:szCs w:val="20"/>
-                <w:rtl w:val="0"/>
-              </w:rPr>
-              <w:t xml:space="preserve">Não</w:t>
             </w:r>
             <w:r>
               <w:rPr>
@@ -13885,16 +14163,19 @@
           </w:tcPr>
           <w:p>
             <w:pPr>
-              <w:rPr/>
-            </w:pPr>
-            <w:r>
-              <w:rPr>
-                <w:rFonts w:ascii="Arial" w:cs="Arial" w:eastAsia="Arial" w:hAnsi="Arial"/>
-                <w:sz w:val="20"/>
-                <w:szCs w:val="20"/>
-                <w:rtl w:val="0"/>
-              </w:rPr>
-              <w:t xml:space="preserve">Remover anexo de chamado</w:t>
+              <w:rPr>
+                <w:rFonts w:ascii="Arial" w:cs="Arial" w:eastAsia="Arial" w:hAnsi="Arial"/>
+                <w:sz w:val="20"/>
+                <w:szCs w:val="20"/>
+              </w:rPr>
+            </w:pPr>
+            <w:r>
+              <w:rPr>
+                <w:sz w:val="20"/>
+                <w:szCs w:val="20"/>
+                <w:rtl w:val="0"/>
+              </w:rPr>
+              <w:t xml:space="preserve">Remover chamado</w:t>
             </w:r>
             <w:r>
               <w:rPr>
@@ -13921,22 +14202,19 @@
           </w:tcPr>
           <w:p>
             <w:pPr>
-              <w:rPr/>
-            </w:pPr>
-            <w:r>
-              <w:rPr>
-                <w:rFonts w:ascii="Arial" w:cs="Arial" w:eastAsia="Arial" w:hAnsi="Arial"/>
+              <w:rPr>
+                <w:sz w:val="20"/>
+                <w:szCs w:val="20"/>
+              </w:rPr>
+            </w:pPr>
+            <w:r>
+              <w:rPr>
                 <w:sz w:val="20"/>
                 <w:szCs w:val="20"/>
                 <w:rtl w:val="0"/>
               </w:rPr>
               <w:t xml:space="preserve">Sim</w:t>
             </w:r>
-            <w:r>
-              <w:rPr>
-                <w:rtl w:val="0"/>
-              </w:rPr>
-            </w:r>
           </w:p>
         </w:tc>
         <w:tc>
@@ -13957,11 +14235,14 @@
           </w:tcPr>
           <w:p>
             <w:pPr>
-              <w:rPr/>
-            </w:pPr>
-            <w:r>
-              <w:rPr>
-                <w:rFonts w:ascii="Arial" w:cs="Arial" w:eastAsia="Arial" w:hAnsi="Arial"/>
+              <w:rPr>
+                <w:rFonts w:ascii="Arial" w:cs="Arial" w:eastAsia="Arial" w:hAnsi="Arial"/>
+                <w:sz w:val="20"/>
+                <w:szCs w:val="20"/>
+              </w:rPr>
+            </w:pPr>
+            <w:r>
+              <w:rPr>
                 <w:sz w:val="20"/>
                 <w:szCs w:val="20"/>
                 <w:rtl w:val="0"/>
@@ -13993,16 +14274,19 @@
           </w:tcPr>
           <w:p>
             <w:pPr>
-              <w:rPr/>
-            </w:pPr>
-            <w:r>
-              <w:rPr>
-                <w:rFonts w:ascii="Arial" w:cs="Arial" w:eastAsia="Arial" w:hAnsi="Arial"/>
-                <w:sz w:val="20"/>
-                <w:szCs w:val="20"/>
-                <w:rtl w:val="0"/>
-              </w:rPr>
-              <w:t xml:space="preserve">Sim</w:t>
+              <w:rPr>
+                <w:rFonts w:ascii="Arial" w:cs="Arial" w:eastAsia="Arial" w:hAnsi="Arial"/>
+                <w:sz w:val="20"/>
+                <w:szCs w:val="20"/>
+              </w:rPr>
+            </w:pPr>
+            <w:r>
+              <w:rPr>
+                <w:sz w:val="20"/>
+                <w:szCs w:val="20"/>
+                <w:rtl w:val="0"/>
+              </w:rPr>
+              <w:t xml:space="preserve">Não</w:t>
             </w:r>
             <w:r>
               <w:rPr>
@@ -14135,7 +14419,7 @@
         <w:shd w:fill="auto" w:val="clear"/>
         <w:spacing w:after="80" w:before="0" w:line="240" w:lineRule="auto"/>
         <w:ind w:left="720" w:right="0" w:hanging="360"/>
-        <w:jc w:val="left"/>
+        <w:jc w:val="both"/>
         <w:rPr/>
       </w:pPr>
       <w:r>
@@ -14178,7 +14462,7 @@
         <w:shd w:fill="auto" w:val="clear"/>
         <w:spacing w:after="80" w:before="0" w:line="240" w:lineRule="auto"/>
         <w:ind w:left="720" w:right="0" w:hanging="360"/>
-        <w:jc w:val="left"/>
+        <w:jc w:val="both"/>
         <w:rPr/>
       </w:pPr>
       <w:r>
@@ -14221,7 +14505,7 @@
         <w:shd w:fill="auto" w:val="clear"/>
         <w:spacing w:after="80" w:before="0" w:line="240" w:lineRule="auto"/>
         <w:ind w:left="720" w:right="0" w:hanging="360"/>
-        <w:jc w:val="left"/>
+        <w:jc w:val="both"/>
         <w:rPr/>
       </w:pPr>
       <w:r>
@@ -14280,6 +14564,7 @@
     <w:p>
       <w:pPr>
         <w:spacing w:after="120" w:lineRule="auto"/>
+        <w:jc w:val="both"/>
         <w:rPr/>
       </w:pPr>
       <w:r>
@@ -14301,6 +14586,7 @@
       <w:pPr>
         <w:spacing w:after="60" w:before="60" w:lineRule="auto"/>
         <w:ind w:left="720" w:firstLine="0"/>
+        <w:jc w:val="both"/>
         <w:rPr/>
       </w:pPr>
       <w:r>
@@ -14311,7 +14597,7 @@
           <w:szCs w:val="20"/>
           <w:rtl w:val="0"/>
         </w:rPr>
-        <w:t xml:space="preserve">git clone &lt;url-do-repositorio&gt;</w:t>
+        <w:t xml:space="preserve">git clone &lt;https://github.com/joaodouglasdantas/dunnas_CAPP.git&gt;</w:t>
       </w:r>
       <w:r>
         <w:rPr>
@@ -14323,6 +14609,7 @@
       <w:pPr>
         <w:spacing w:after="60" w:before="60" w:lineRule="auto"/>
         <w:ind w:left="720" w:firstLine="0"/>
+        <w:jc w:val="both"/>
         <w:rPr/>
       </w:pPr>
       <w:r>
@@ -14343,6 +14630,7 @@
     </w:p>
     <w:p>
       <w:pPr>
+        <w:jc w:val="both"/>
         <w:rPr/>
       </w:pPr>
       <w:r>
@@ -14354,6 +14642,7 @@
     <w:p>
       <w:pPr>
         <w:spacing w:after="120" w:lineRule="auto"/>
+        <w:jc w:val="both"/>
         <w:rPr/>
       </w:pPr>
       <w:r>
@@ -14375,6 +14664,7 @@
       <w:pPr>
         <w:spacing w:after="60" w:before="60" w:lineRule="auto"/>
         <w:ind w:left="720" w:firstLine="0"/>
+        <w:jc w:val="both"/>
         <w:rPr/>
       </w:pPr>
       <w:r>
@@ -14396,6 +14686,7 @@
     <w:p>
       <w:pPr>
         <w:spacing w:after="120" w:lineRule="auto"/>
+        <w:jc w:val="both"/>
         <w:rPr/>
       </w:pPr>
       <w:r>
@@ -14415,6 +14706,7 @@
     </w:p>
     <w:p>
       <w:pPr>
+        <w:jc w:val="both"/>
         <w:rPr/>
       </w:pPr>
       <w:r>
@@ -14426,6 +14718,7 @@
     <w:p>
       <w:pPr>
         <w:spacing w:after="120" w:lineRule="auto"/>
+        <w:jc w:val="both"/>
         <w:rPr/>
       </w:pPr>
       <w:r>
@@ -14447,6 +14740,7 @@
       <w:pPr>
         <w:spacing w:after="60" w:before="60" w:lineRule="auto"/>
         <w:ind w:left="720" w:firstLine="0"/>
+        <w:jc w:val="both"/>
         <w:rPr/>
       </w:pPr>
       <w:r>
@@ -14467,6 +14761,7 @@
     </w:p>
     <w:p>
       <w:pPr>
+        <w:jc w:val="both"/>
         <w:rPr/>
       </w:pPr>
       <w:r>
@@ -14478,6 +14773,7 @@
     <w:p>
       <w:pPr>
         <w:spacing w:after="120" w:lineRule="auto"/>
+        <w:jc w:val="both"/>
         <w:rPr/>
       </w:pPr>
       <w:r>
@@ -14499,6 +14795,7 @@
       <w:pPr>
         <w:spacing w:after="60" w:before="60" w:lineRule="auto"/>
         <w:ind w:left="720" w:firstLine="0"/>
+        <w:jc w:val="both"/>
         <w:rPr/>
       </w:pPr>
       <w:r>
@@ -14519,6 +14816,7 @@
     </w:p>
     <w:p>
       <w:pPr>
+        <w:jc w:val="both"/>
         <w:rPr/>
       </w:pPr>
       <w:r>
@@ -14530,6 +14828,7 @@
     <w:p>
       <w:pPr>
         <w:spacing w:after="120" w:lineRule="auto"/>
+        <w:jc w:val="both"/>
         <w:rPr/>
       </w:pPr>
       <w:r>
@@ -14551,22 +14850,137 @@
       <w:pPr>
         <w:spacing w:after="60" w:before="60" w:lineRule="auto"/>
         <w:ind w:left="720" w:firstLine="0"/>
-        <w:rPr/>
-      </w:pPr>
-      <w:r>
+        <w:jc w:val="both"/>
         <w:rPr>
           <w:rFonts w:ascii="Courier New" w:cs="Courier New" w:eastAsia="Courier New" w:hAnsi="Courier New"/>
           <w:color w:val="5b21b6"/>
           <w:sz w:val="20"/>
           <w:szCs w:val="20"/>
-          <w:rtl w:val="0"/>
-        </w:rPr>
-        <w:t xml:space="preserve">http://localhost:3000</w:t>
-      </w:r>
-      <w:r>
-        <w:rPr>
-          <w:rtl w:val="0"/>
-        </w:rPr>
+        </w:rPr>
+      </w:pPr>
+      <w:hyperlink r:id="rId8">
+        <w:r>
+          <w:rPr>
+            <w:rFonts w:ascii="Courier New" w:cs="Courier New" w:eastAsia="Courier New" w:hAnsi="Courier New"/>
+            <w:color w:val="1155cc"/>
+            <w:sz w:val="20"/>
+            <w:szCs w:val="20"/>
+            <w:u w:val="single"/>
+            <w:rtl w:val="0"/>
+          </w:rPr>
+          <w:t xml:space="preserve">http://localhost:3000</w:t>
+        </w:r>
+      </w:hyperlink>
+      <w:r>
+        <w:rPr>
+          <w:rtl w:val="0"/>
+        </w:rPr>
+      </w:r>
+    </w:p>
+    <w:p>
+      <w:pPr>
+        <w:spacing w:after="120" w:lineRule="auto"/>
+        <w:ind w:firstLine="720"/>
+        <w:jc w:val="both"/>
+        <w:rPr/>
+      </w:pPr>
+      <w:r>
+        <w:rPr>
+          <w:rtl w:val="0"/>
+        </w:rPr>
+        <w:t xml:space="preserve">Ou acessar a  URL de produção:</w:t>
+      </w:r>
+    </w:p>
+    <w:p>
+      <w:pPr>
+        <w:spacing w:after="60" w:before="60" w:lineRule="auto"/>
+        <w:ind w:left="720" w:firstLine="0"/>
+        <w:jc w:val="both"/>
+        <w:rPr/>
+      </w:pPr>
+      <w:hyperlink r:id="rId9">
+        <w:r>
+          <w:rPr>
+            <w:rFonts w:ascii="Courier New" w:cs="Courier New" w:eastAsia="Courier New" w:hAnsi="Courier New"/>
+            <w:color w:val="1155cc"/>
+            <w:sz w:val="20"/>
+            <w:szCs w:val="20"/>
+            <w:u w:val="single"/>
+            <w:rtl w:val="0"/>
+          </w:rPr>
+          <w:t xml:space="preserve">https://dunnas-capp.onrender.com</w:t>
+        </w:r>
+      </w:hyperlink>
+      <w:r>
+        <w:rPr>
+          <w:rtl w:val="0"/>
+        </w:rPr>
+      </w:r>
+    </w:p>
+    <w:p>
+      <w:pPr>
+        <w:spacing w:after="60" w:before="60" w:lineRule="auto"/>
+        <w:ind w:left="720" w:firstLine="0"/>
+        <w:jc w:val="both"/>
+        <w:rPr>
+          <w:rFonts w:ascii="Courier New" w:cs="Courier New" w:eastAsia="Courier New" w:hAnsi="Courier New"/>
+          <w:color w:val="5b21b6"/>
+          <w:sz w:val="20"/>
+          <w:szCs w:val="20"/>
+        </w:rPr>
+      </w:pPr>
+      <w:r>
+        <w:rPr>
+          <w:rtl w:val="0"/>
+        </w:rPr>
+      </w:r>
+    </w:p>
+    <w:p>
+      <w:pPr>
+        <w:spacing w:after="120" w:lineRule="auto"/>
+        <w:jc w:val="both"/>
+        <w:rPr>
+          <w:b w:val="1"/>
+          <w:bCs w:val="1"/>
+        </w:rPr>
+      </w:pPr>
+      <w:r>
+        <w:rPr>
+          <w:rtl w:val="0"/>
+        </w:rPr>
+        <w:t xml:space="preserve">⚠️</w:t>
+      </w:r>
+      <w:r>
+        <w:rPr>
+          <w:b w:val="1"/>
+          <w:bCs w:val="1"/>
+          <w:rtl w:val="0"/>
+        </w:rPr>
+        <w:t xml:space="preserve">Comportamento do Render no plano gratuito:</w:t>
+      </w:r>
+    </w:p>
+    <w:p>
+      <w:pPr>
+        <w:spacing w:after="120" w:lineRule="auto"/>
+        <w:jc w:val="both"/>
+        <w:rPr>
+          <w:b w:val="1"/>
+          <w:bCs w:val="1"/>
+          <w:color w:val="7c3aed"/>
+          <w:sz w:val="20"/>
+          <w:szCs w:val="20"/>
+        </w:rPr>
+      </w:pPr>
+      <w:r>
+        <w:rPr>
+          <w:b w:val="1"/>
+          <w:bCs w:val="1"/>
+          <w:color w:val="7c3aed"/>
+          <w:sz w:val="20"/>
+          <w:szCs w:val="20"/>
+          <w:rtl w:val="0"/>
+        </w:rPr>
+        <w:t xml:space="preserve">O sistema está hospedado no Render (plano gratuito) e entra em modo de hibernação após 15 minutos sem uso. Na primeira tentativa de acesso do dia, aguarde entre 30 e 60 segundos para o servidor acordar.</w:t>
       </w:r>
     </w:p>
     <w:p>
@@ -14983,6 +15397,7 @@
     <w:p>
       <w:pPr>
         <w:spacing w:after="120" w:lineRule="auto"/>
+        <w:jc w:val="both"/>
         <w:rPr/>
       </w:pPr>
       <w:r>
@@ -15020,7 +15435,7 @@
         <w:shd w:fill="auto" w:val="clear"/>
         <w:spacing w:after="80" w:before="0" w:line="240" w:lineRule="auto"/>
         <w:ind w:left="720" w:right="0" w:hanging="360"/>
-        <w:jc w:val="left"/>
+        <w:jc w:val="both"/>
         <w:rPr/>
       </w:pPr>
       <w:r>
@@ -15063,7 +15478,7 @@
         <w:shd w:fill="auto" w:val="clear"/>
         <w:spacing w:after="80" w:before="0" w:line="240" w:lineRule="auto"/>
         <w:ind w:left="720" w:right="0" w:hanging="360"/>
-        <w:jc w:val="left"/>
+        <w:jc w:val="both"/>
         <w:rPr/>
       </w:pPr>
       <w:r>
@@ -15106,7 +15521,7 @@
         <w:shd w:fill="auto" w:val="clear"/>
         <w:spacing w:after="80" w:before="0" w:line="240" w:lineRule="auto"/>
         <w:ind w:left="720" w:right="0" w:hanging="360"/>
-        <w:jc w:val="left"/>
+        <w:jc w:val="both"/>
         <w:rPr/>
       </w:pPr>
       <w:r>
@@ -15149,7 +15564,7 @@
         <w:shd w:fill="auto" w:val="clear"/>
         <w:spacing w:after="80" w:before="0" w:line="240" w:lineRule="auto"/>
         <w:ind w:left="720" w:right="0" w:hanging="360"/>
-        <w:jc w:val="left"/>
+        <w:jc w:val="both"/>
         <w:rPr/>
       </w:pPr>
       <w:r>
@@ -15209,6 +15624,7 @@
       <w:pPr>
         <w:spacing w:after="60" w:before="60" w:lineRule="auto"/>
         <w:ind w:left="720" w:firstLine="0"/>
+        <w:jc w:val="both"/>
         <w:rPr/>
       </w:pPr>
       <w:r>
@@ -15309,6 +15725,7 @@
     <w:p>
       <w:pPr>
         <w:spacing w:after="120" w:lineRule="auto"/>
+        <w:jc w:val="both"/>
         <w:rPr/>
       </w:pPr>
       <w:r>
@@ -15346,7 +15763,7 @@
         <w:shd w:fill="auto" w:val="clear"/>
         <w:spacing w:after="80" w:before="0" w:line="240" w:lineRule="auto"/>
         <w:ind w:left="720" w:right="0" w:hanging="360"/>
-        <w:jc w:val="left"/>
+        <w:jc w:val="both"/>
         <w:rPr/>
       </w:pPr>
       <w:r>
@@ -15389,7 +15806,7 @@
         <w:shd w:fill="auto" w:val="clear"/>
         <w:spacing w:after="80" w:before="0" w:line="240" w:lineRule="auto"/>
         <w:ind w:left="720" w:right="0" w:hanging="360"/>
-        <w:jc w:val="left"/>
+        <w:jc w:val="both"/>
         <w:rPr/>
       </w:pPr>
       <w:r>
@@ -15432,7 +15849,7 @@
         <w:shd w:fill="auto" w:val="clear"/>
         <w:spacing w:after="80" w:before="0" w:line="240" w:lineRule="auto"/>
         <w:ind w:left="720" w:right="0" w:hanging="360"/>
-        <w:jc w:val="left"/>
+        <w:jc w:val="both"/>
         <w:rPr/>
       </w:pPr>
       <w:r>
@@ -15457,6 +15874,7 @@
     </w:p>
     <w:p>
       <w:pPr>
+        <w:jc w:val="both"/>
         <w:rPr/>
       </w:pPr>
       <w:r>
@@ -15468,6 +15886,7 @@
     <w:p>
       <w:pPr>
         <w:spacing w:after="120" w:lineRule="auto"/>
+        <w:jc w:val="both"/>
         <w:rPr/>
       </w:pPr>
       <w:r>
@@ -15505,7 +15924,7 @@
         <w:shd w:fill="auto" w:val="clear"/>
         <w:spacing w:after="80" w:before="0" w:line="240" w:lineRule="auto"/>
         <w:ind w:left="720" w:right="0" w:hanging="360"/>
-        <w:jc w:val="left"/>
+        <w:jc w:val="both"/>
         <w:rPr/>
       </w:pPr>
       <w:r>
@@ -15548,7 +15967,7 @@
         <w:shd w:fill="auto" w:val="clear"/>
         <w:spacing w:after="80" w:before="0" w:line="240" w:lineRule="auto"/>
         <w:ind w:left="720" w:right="0" w:hanging="360"/>
-        <w:jc w:val="left"/>
+        <w:jc w:val="both"/>
         <w:rPr/>
       </w:pPr>
       <w:r>
@@ -15624,7 +16043,7 @@
         <w:shd w:fill="auto" w:val="clear"/>
         <w:spacing w:after="80" w:before="0" w:line="240" w:lineRule="auto"/>
         <w:ind w:left="720" w:right="0" w:hanging="360"/>
-        <w:jc w:val="left"/>
+        <w:jc w:val="both"/>
         <w:rPr/>
       </w:pPr>
       <w:r>
@@ -15667,7 +16086,7 @@
         <w:shd w:fill="auto" w:val="clear"/>
         <w:spacing w:after="80" w:before="0" w:line="240" w:lineRule="auto"/>
         <w:ind w:left="720" w:right="0" w:hanging="360"/>
-        <w:jc w:val="left"/>
+        <w:jc w:val="both"/>
         <w:rPr/>
       </w:pPr>
       <w:r>
@@ -15710,7 +16129,7 @@
         <w:shd w:fill="auto" w:val="clear"/>
         <w:spacing w:after="80" w:before="0" w:line="240" w:lineRule="auto"/>
         <w:ind w:left="720" w:right="0" w:hanging="360"/>
-        <w:jc w:val="left"/>
+        <w:jc w:val="both"/>
         <w:rPr/>
       </w:pPr>
       <w:r>
@@ -16615,6 +17034,7 @@
     <w:p>
       <w:pPr>
         <w:spacing w:after="120" w:lineRule="auto"/>
+        <w:jc w:val="both"/>
         <w:rPr/>
       </w:pPr>
       <w:r>
@@ -18056,7 +18476,7 @@
         <w:shd w:fill="auto" w:val="clear"/>
         <w:spacing w:after="80" w:before="0" w:line="240" w:lineRule="auto"/>
         <w:ind w:left="720" w:right="0" w:hanging="360"/>
-        <w:jc w:val="left"/>
+        <w:jc w:val="both"/>
         <w:rPr/>
       </w:pPr>
       <w:r>
@@ -18077,6 +18497,66 @@
           <w:rtl w:val="0"/>
         </w:rPr>
         <w:t xml:space="preserve">Navbar fixa superior com logo clicável e navegação adaptada por perfil</w:t>
+      </w:r>
+    </w:p>
+    <w:p>
+      <w:pPr>
+        <w:keepNext w:val="0"/>
+        <w:keepLines w:val="0"/>
+        <w:pageBreakBefore w:val="0"/>
+        <w:widowControl w:val="1"/>
+        <w:pBdr>
+          <w:top w:space="0" w:sz="0" w:val="nil"/>
+          <w:left w:space="0" w:sz="0" w:val="nil"/>
+          <w:bottom w:space="0" w:sz="0" w:val="nil"/>
+          <w:right w:space="0" w:sz="0" w:val="nil"/>
+          <w:between w:space="0" w:sz="0" w:val="nil"/>
+        </w:pBdr>
+        <w:shd w:fill="auto" w:val="clear"/>
+        <w:spacing w:after="80" w:before="0" w:line="240" w:lineRule="auto"/>
+        <w:ind w:left="0" w:right="0" w:firstLine="720"/>
+        <w:jc w:val="both"/>
+        <w:rPr/>
+      </w:pPr>
+      <w:r>
+        <w:rPr/>
+        <w:drawing>
+          <wp:inline distB="114300" distT="114300" distL="114300" distR="114300">
+            <wp:extent cx="5731200" cy="177800"/>
+            <wp:effectExtent b="0" l="0" r="0" t="0"/>
+            <wp:docPr id="5" name="image4.png"/>
+            <a:graphic>
+              <a:graphicData uri="http://schemas.openxmlformats.org/drawingml/2006/picture">
+                <pic:pic>
+                  <pic:nvPicPr>
+                    <pic:cNvPr id="0" name="image4.png"/>
+                    <pic:cNvPicPr preferRelativeResize="0"/>
+                  </pic:nvPicPr>
+                  <pic:blipFill>
+                    <a:blip r:embed="rId10"/>
+                    <a:srcRect b="0" l="0" r="0" t="0"/>
+                    <a:stretch>
+                      <a:fillRect/>
+                    </a:stretch>
+                  </pic:blipFill>
+                  <pic:spPr>
+                    <a:xfrm>
+                      <a:off x="0" y="0"/>
+                      <a:ext cx="5731200" cy="177800"/>
+                    </a:xfrm>
+                    <a:prstGeom prst="rect"/>
+                    <a:ln/>
+                  </pic:spPr>
+                </pic:pic>
+              </a:graphicData>
+            </a:graphic>
+          </wp:inline>
+        </w:drawing>
+      </w:r>
+      <w:r>
+        <w:rPr>
+          <w:rtl w:val="0"/>
+        </w:rPr>
       </w:r>
     </w:p>
     <w:p>
@@ -18099,7 +18579,7 @@
         <w:shd w:fill="auto" w:val="clear"/>
         <w:spacing w:after="80" w:before="0" w:line="240" w:lineRule="auto"/>
         <w:ind w:left="720" w:right="0" w:hanging="360"/>
-        <w:jc w:val="left"/>
+        <w:jc w:val="both"/>
         <w:rPr/>
       </w:pPr>
       <w:r>
@@ -18120,6 +18600,66 @@
           <w:rtl w:val="0"/>
         </w:rPr>
         <w:t xml:space="preserve">Menu sanduíche responsivo que expande verticalmente em dispositivos móveis</w:t>
+      </w:r>
+    </w:p>
+    <w:p>
+      <w:pPr>
+        <w:keepNext w:val="0"/>
+        <w:keepLines w:val="0"/>
+        <w:pageBreakBefore w:val="0"/>
+        <w:widowControl w:val="1"/>
+        <w:pBdr>
+          <w:top w:space="0" w:sz="0" w:val="nil"/>
+          <w:left w:space="0" w:sz="0" w:val="nil"/>
+          <w:bottom w:space="0" w:sz="0" w:val="nil"/>
+          <w:right w:space="0" w:sz="0" w:val="nil"/>
+          <w:between w:space="0" w:sz="0" w:val="nil"/>
+        </w:pBdr>
+        <w:shd w:fill="auto" w:val="clear"/>
+        <w:spacing w:after="80" w:before="0" w:line="240" w:lineRule="auto"/>
+        <w:ind w:left="0" w:right="0" w:firstLine="720"/>
+        <w:jc w:val="both"/>
+        <w:rPr/>
+      </w:pPr>
+      <w:r>
+        <w:rPr/>
+        <w:drawing>
+          <wp:inline distB="114300" distT="114300" distL="114300" distR="114300">
+            <wp:extent cx="1833563" cy="1929677"/>
+            <wp:effectExtent b="0" l="0" r="0" t="0"/>
+            <wp:docPr id="3" name="image2.png"/>
+            <a:graphic>
+              <a:graphicData uri="http://schemas.openxmlformats.org/drawingml/2006/picture">
+                <pic:pic>
+                  <pic:nvPicPr>
+                    <pic:cNvPr id="0" name="image2.png"/>
+                    <pic:cNvPicPr preferRelativeResize="0"/>
+                  </pic:nvPicPr>
+                  <pic:blipFill>
+                    <a:blip r:embed="rId11"/>
+                    <a:srcRect b="0" l="0" r="0" t="0"/>
+                    <a:stretch>
+                      <a:fillRect/>
+                    </a:stretch>
+                  </pic:blipFill>
+                  <pic:spPr>
+                    <a:xfrm>
+                      <a:off x="0" y="0"/>
+                      <a:ext cx="1833563" cy="1929677"/>
+                    </a:xfrm>
+                    <a:prstGeom prst="rect"/>
+                    <a:ln/>
+                  </pic:spPr>
+                </pic:pic>
+              </a:graphicData>
+            </a:graphic>
+          </wp:inline>
+        </w:drawing>
+      </w:r>
+      <w:r>
+        <w:rPr>
+          <w:rtl w:val="0"/>
+        </w:rPr>
       </w:r>
     </w:p>
     <w:p>
@@ -18142,7 +18682,7 @@
         <w:shd w:fill="auto" w:val="clear"/>
         <w:spacing w:after="80" w:before="0" w:line="240" w:lineRule="auto"/>
         <w:ind w:left="720" w:right="0" w:hanging="360"/>
-        <w:jc w:val="left"/>
+        <w:jc w:val="both"/>
         <w:rPr/>
       </w:pPr>
       <w:r>
@@ -18163,6 +18703,66 @@
           <w:rtl w:val="0"/>
         </w:rPr>
         <w:t xml:space="preserve">Dashboard com cards de métricas (totais de blocos, chamados, usuários) e números em destaque roxo</w:t>
+      </w:r>
+    </w:p>
+    <w:p>
+      <w:pPr>
+        <w:keepNext w:val="0"/>
+        <w:keepLines w:val="0"/>
+        <w:pageBreakBefore w:val="0"/>
+        <w:widowControl w:val="1"/>
+        <w:pBdr>
+          <w:top w:space="0" w:sz="0" w:val="nil"/>
+          <w:left w:space="0" w:sz="0" w:val="nil"/>
+          <w:bottom w:space="0" w:sz="0" w:val="nil"/>
+          <w:right w:space="0" w:sz="0" w:val="nil"/>
+          <w:between w:space="0" w:sz="0" w:val="nil"/>
+        </w:pBdr>
+        <w:shd w:fill="auto" w:val="clear"/>
+        <w:spacing w:after="80" w:before="0" w:line="240" w:lineRule="auto"/>
+        <w:ind w:left="0" w:right="0" w:firstLine="720"/>
+        <w:jc w:val="both"/>
+        <w:rPr/>
+      </w:pPr>
+      <w:r>
+        <w:rPr/>
+        <w:drawing>
+          <wp:inline distB="114300" distT="114300" distL="114300" distR="114300">
+            <wp:extent cx="3433763" cy="1188610"/>
+            <wp:effectExtent b="0" l="0" r="0" t="0"/>
+            <wp:docPr id="7" name="image8.png"/>
+            <a:graphic>
+              <a:graphicData uri="http://schemas.openxmlformats.org/drawingml/2006/picture">
+                <pic:pic>
+                  <pic:nvPicPr>
+                    <pic:cNvPr id="0" name="image8.png"/>
+                    <pic:cNvPicPr preferRelativeResize="0"/>
+                  </pic:nvPicPr>
+                  <pic:blipFill>
+                    <a:blip r:embed="rId12"/>
+                    <a:srcRect b="0" l="0" r="0" t="0"/>
+                    <a:stretch>
+                      <a:fillRect/>
+                    </a:stretch>
+                  </pic:blipFill>
+                  <pic:spPr>
+                    <a:xfrm>
+                      <a:off x="0" y="0"/>
+                      <a:ext cx="3433763" cy="1188610"/>
+                    </a:xfrm>
+                    <a:prstGeom prst="rect"/>
+                    <a:ln/>
+                  </pic:spPr>
+                </pic:pic>
+              </a:graphicData>
+            </a:graphic>
+          </wp:inline>
+        </w:drawing>
+      </w:r>
+      <w:r>
+        <w:rPr>
+          <w:rtl w:val="0"/>
+        </w:rPr>
       </w:r>
     </w:p>
     <w:p>
@@ -18185,7 +18785,7 @@
         <w:shd w:fill="auto" w:val="clear"/>
         <w:spacing w:after="80" w:before="0" w:line="240" w:lineRule="auto"/>
         <w:ind w:left="720" w:right="0" w:hanging="360"/>
-        <w:jc w:val="left"/>
+        <w:jc w:val="both"/>
         <w:rPr/>
       </w:pPr>
       <w:r>
@@ -18206,6 +18806,71 @@
           <w:rtl w:val="0"/>
         </w:rPr>
         <w:t xml:space="preserve">Tabelas com fundo #1a2e4a, cabeçalhos em cinza, linhas com hover sutil</w:t>
+      </w:r>
+      <w:r>
+        <w:rPr>
+          <w:rtl w:val="0"/>
+        </w:rPr>
+      </w:r>
+    </w:p>
+    <w:p>
+      <w:pPr>
+        <w:keepNext w:val="0"/>
+        <w:keepLines w:val="0"/>
+        <w:pageBreakBefore w:val="0"/>
+        <w:widowControl w:val="1"/>
+        <w:pBdr>
+          <w:top w:space="0" w:sz="0" w:val="nil"/>
+          <w:left w:space="0" w:sz="0" w:val="nil"/>
+          <w:bottom w:space="0" w:sz="0" w:val="nil"/>
+          <w:right w:space="0" w:sz="0" w:val="nil"/>
+          <w:between w:space="0" w:sz="0" w:val="nil"/>
+        </w:pBdr>
+        <w:shd w:fill="auto" w:val="clear"/>
+        <w:spacing w:after="80" w:before="0" w:line="240" w:lineRule="auto"/>
+        <w:ind w:left="720" w:right="0" w:firstLine="0"/>
+        <w:jc w:val="both"/>
+        <w:rPr/>
+      </w:pPr>
+      <w:r>
+        <w:rPr/>
+        <w:drawing>
+          <wp:inline distB="114300" distT="114300" distL="114300" distR="114300">
+            <wp:extent cx="5731200" cy="863600"/>
+            <wp:effectExtent b="0" l="0" r="0" t="0"/>
+            <wp:docPr id="6" name="image9.png"/>
+            <a:graphic>
+              <a:graphicData uri="http://schemas.openxmlformats.org/drawingml/2006/picture">
+                <pic:pic>
+                  <pic:nvPicPr>
+                    <pic:cNvPr id="0" name="image9.png"/>
+                    <pic:cNvPicPr preferRelativeResize="0"/>
+                  </pic:nvPicPr>
+                  <pic:blipFill>
+                    <a:blip r:embed="rId13"/>
+                    <a:srcRect b="0" l="0" r="0" t="0"/>
+                    <a:stretch>
+                      <a:fillRect/>
+                    </a:stretch>
+                  </pic:blipFill>
+                  <pic:spPr>
+                    <a:xfrm>
+                      <a:off x="0" y="0"/>
+                      <a:ext cx="5731200" cy="863600"/>
+                    </a:xfrm>
+                    <a:prstGeom prst="rect"/>
+                    <a:ln/>
+                  </pic:spPr>
+                </pic:pic>
+              </a:graphicData>
+            </a:graphic>
+          </wp:inline>
+        </w:drawing>
+      </w:r>
+      <w:r>
+        <w:rPr>
+          <w:rtl w:val="0"/>
+        </w:rPr>
       </w:r>
     </w:p>
     <w:p>
@@ -18228,7 +18893,7 @@
         <w:shd w:fill="auto" w:val="clear"/>
         <w:spacing w:after="80" w:before="0" w:line="240" w:lineRule="auto"/>
         <w:ind w:left="720" w:right="0" w:hanging="360"/>
-        <w:jc w:val="left"/>
+        <w:jc w:val="both"/>
         <w:rPr/>
       </w:pPr>
       <w:r>
@@ -18249,6 +18914,66 @@
           <w:rtl w:val="0"/>
         </w:rPr>
         <w:t xml:space="preserve">Badges coloridos para status de chamado</w:t>
+      </w:r>
+    </w:p>
+    <w:p>
+      <w:pPr>
+        <w:keepNext w:val="0"/>
+        <w:keepLines w:val="0"/>
+        <w:pageBreakBefore w:val="0"/>
+        <w:widowControl w:val="1"/>
+        <w:pBdr>
+          <w:top w:space="0" w:sz="0" w:val="nil"/>
+          <w:left w:space="0" w:sz="0" w:val="nil"/>
+          <w:bottom w:space="0" w:sz="0" w:val="nil"/>
+          <w:right w:space="0" w:sz="0" w:val="nil"/>
+          <w:between w:space="0" w:sz="0" w:val="nil"/>
+        </w:pBdr>
+        <w:shd w:fill="auto" w:val="clear"/>
+        <w:spacing w:after="80" w:before="0" w:line="240" w:lineRule="auto"/>
+        <w:ind w:left="720" w:right="0" w:firstLine="0"/>
+        <w:jc w:val="both"/>
+        <w:rPr/>
+      </w:pPr>
+      <w:r>
+        <w:rPr/>
+        <w:drawing>
+          <wp:inline distB="114300" distT="114300" distL="114300" distR="114300">
+            <wp:extent cx="5731200" cy="1333500"/>
+            <wp:effectExtent b="0" l="0" r="0" t="0"/>
+            <wp:docPr id="9" name="image7.png"/>
+            <a:graphic>
+              <a:graphicData uri="http://schemas.openxmlformats.org/drawingml/2006/picture">
+                <pic:pic>
+                  <pic:nvPicPr>
+                    <pic:cNvPr id="0" name="image7.png"/>
+                    <pic:cNvPicPr preferRelativeResize="0"/>
+                  </pic:nvPicPr>
+                  <pic:blipFill>
+                    <a:blip r:embed="rId14"/>
+                    <a:srcRect b="0" l="0" r="0" t="0"/>
+                    <a:stretch>
+                      <a:fillRect/>
+                    </a:stretch>
+                  </pic:blipFill>
+                  <pic:spPr>
+                    <a:xfrm>
+                      <a:off x="0" y="0"/>
+                      <a:ext cx="5731200" cy="1333500"/>
+                    </a:xfrm>
+                    <a:prstGeom prst="rect"/>
+                    <a:ln/>
+                  </pic:spPr>
+                </pic:pic>
+              </a:graphicData>
+            </a:graphic>
+          </wp:inline>
+        </w:drawing>
+      </w:r>
+      <w:r>
+        <w:rPr>
+          <w:rtl w:val="0"/>
+        </w:rPr>
       </w:r>
     </w:p>
     <w:p>
@@ -18271,7 +18996,7 @@
         <w:shd w:fill="auto" w:val="clear"/>
         <w:spacing w:after="80" w:before="0" w:line="240" w:lineRule="auto"/>
         <w:ind w:left="720" w:right="0" w:hanging="360"/>
-        <w:jc w:val="left"/>
+        <w:jc w:val="both"/>
         <w:rPr/>
       </w:pPr>
       <w:r>
@@ -18292,6 +19017,66 @@
           <w:rtl w:val="0"/>
         </w:rPr>
         <w:t xml:space="preserve">Formulário de filtros com selects estilizados (status, tipo, bloco, período)</w:t>
+      </w:r>
+    </w:p>
+    <w:p>
+      <w:pPr>
+        <w:keepNext w:val="0"/>
+        <w:keepLines w:val="0"/>
+        <w:pageBreakBefore w:val="0"/>
+        <w:widowControl w:val="1"/>
+        <w:pBdr>
+          <w:top w:space="0" w:sz="0" w:val="nil"/>
+          <w:left w:space="0" w:sz="0" w:val="nil"/>
+          <w:bottom w:space="0" w:sz="0" w:val="nil"/>
+          <w:right w:space="0" w:sz="0" w:val="nil"/>
+          <w:between w:space="0" w:sz="0" w:val="nil"/>
+        </w:pBdr>
+        <w:shd w:fill="auto" w:val="clear"/>
+        <w:spacing w:after="80" w:before="0" w:line="240" w:lineRule="auto"/>
+        <w:ind w:left="720" w:right="0" w:firstLine="0"/>
+        <w:jc w:val="both"/>
+        <w:rPr/>
+      </w:pPr>
+      <w:r>
+        <w:rPr/>
+        <w:drawing>
+          <wp:inline distB="114300" distT="114300" distL="114300" distR="114300">
+            <wp:extent cx="5731200" cy="1346200"/>
+            <wp:effectExtent b="0" l="0" r="0" t="0"/>
+            <wp:docPr id="1" name="image3.png"/>
+            <a:graphic>
+              <a:graphicData uri="http://schemas.openxmlformats.org/drawingml/2006/picture">
+                <pic:pic>
+                  <pic:nvPicPr>
+                    <pic:cNvPr id="0" name="image3.png"/>
+                    <pic:cNvPicPr preferRelativeResize="0"/>
+                  </pic:nvPicPr>
+                  <pic:blipFill>
+                    <a:blip r:embed="rId15"/>
+                    <a:srcRect b="0" l="0" r="0" t="0"/>
+                    <a:stretch>
+                      <a:fillRect/>
+                    </a:stretch>
+                  </pic:blipFill>
+                  <pic:spPr>
+                    <a:xfrm>
+                      <a:off x="0" y="0"/>
+                      <a:ext cx="5731200" cy="1346200"/>
+                    </a:xfrm>
+                    <a:prstGeom prst="rect"/>
+                    <a:ln/>
+                  </pic:spPr>
+                </pic:pic>
+              </a:graphicData>
+            </a:graphic>
+          </wp:inline>
+        </w:drawing>
+      </w:r>
+      <w:r>
+        <w:rPr>
+          <w:rtl w:val="0"/>
+        </w:rPr>
       </w:r>
     </w:p>
     <w:p>
@@ -18314,7 +19099,7 @@
         <w:shd w:fill="auto" w:val="clear"/>
         <w:spacing w:after="80" w:before="0" w:line="240" w:lineRule="auto"/>
         <w:ind w:left="720" w:right="0" w:hanging="360"/>
-        <w:jc w:val="left"/>
+        <w:jc w:val="both"/>
         <w:rPr/>
       </w:pPr>
       <w:r>
@@ -18334,7 +19119,92 @@
           <w:vertAlign w:val="baseline"/>
           <w:rtl w:val="0"/>
         </w:rPr>
-        <w:t xml:space="preserve">Tela de login com card centralizado, título "Capp" e subtítulo do sistema</w:t>
+        <w:t xml:space="preserve">Tela de login com card centralizado, </w:t>
+      </w:r>
+      <w:r>
+        <w:rPr>
+          <w:rtl w:val="0"/>
+        </w:rPr>
+        <w:t xml:space="preserve">logo</w:t>
+      </w:r>
+      <w:r>
+        <w:rPr>
+          <w:rFonts w:ascii="Arial" w:cs="Arial" w:eastAsia="Arial" w:hAnsi="Arial"/>
+          <w:b w:val="0"/>
+          <w:bCs w:val="0"/>
+          <w:i w:val="0"/>
+          <w:iCs w:val="0"/>
+          <w:smallCaps w:val="0"/>
+          <w:strike w:val="0"/>
+          <w:color w:val="000000"/>
+          <w:sz w:val="22"/>
+          <w:szCs w:val="22"/>
+          <w:u w:val="none"/>
+          <w:shd w:fill="auto" w:val="clear"/>
+          <w:vertAlign w:val="baseline"/>
+          <w:rtl w:val="0"/>
+        </w:rPr>
+        <w:t xml:space="preserve"> "Capp" e subtítulo do sistema</w:t>
+      </w:r>
+    </w:p>
+    <w:p>
+      <w:pPr>
+        <w:keepNext w:val="0"/>
+        <w:keepLines w:val="0"/>
+        <w:pageBreakBefore w:val="0"/>
+        <w:widowControl w:val="1"/>
+        <w:pBdr>
+          <w:top w:space="0" w:sz="0" w:val="nil"/>
+          <w:left w:space="0" w:sz="0" w:val="nil"/>
+          <w:bottom w:space="0" w:sz="0" w:val="nil"/>
+          <w:right w:space="0" w:sz="0" w:val="nil"/>
+          <w:between w:space="0" w:sz="0" w:val="nil"/>
+        </w:pBdr>
+        <w:shd w:fill="auto" w:val="clear"/>
+        <w:spacing w:after="80" w:before="0" w:line="240" w:lineRule="auto"/>
+        <w:ind w:left="720" w:right="0" w:firstLine="0"/>
+        <w:jc w:val="both"/>
+        <w:rPr/>
+      </w:pPr>
+      <w:r>
+        <w:rPr/>
+        <w:drawing>
+          <wp:inline distB="114300" distT="114300" distL="114300" distR="114300">
+            <wp:extent cx="2675023" cy="2795588"/>
+            <wp:effectExtent b="0" l="0" r="0" t="0"/>
+            <wp:docPr id="4" name="image1.png"/>
+            <a:graphic>
+              <a:graphicData uri="http://schemas.openxmlformats.org/drawingml/2006/picture">
+                <pic:pic>
+                  <pic:nvPicPr>
+                    <pic:cNvPr id="0" name="image1.png"/>
+                    <pic:cNvPicPr preferRelativeResize="0"/>
+                  </pic:nvPicPr>
+                  <pic:blipFill>
+                    <a:blip r:embed="rId16"/>
+                    <a:srcRect b="0" l="0" r="0" t="0"/>
+                    <a:stretch>
+                      <a:fillRect/>
+                    </a:stretch>
+                  </pic:blipFill>
+                  <pic:spPr>
+                    <a:xfrm>
+                      <a:off x="0" y="0"/>
+                      <a:ext cx="2675023" cy="2795588"/>
+                    </a:xfrm>
+                    <a:prstGeom prst="rect"/>
+                    <a:ln/>
+                  </pic:spPr>
+                </pic:pic>
+              </a:graphicData>
+            </a:graphic>
+          </wp:inline>
+        </w:drawing>
+      </w:r>
+      <w:r>
+        <w:rPr>
+          <w:rtl w:val="0"/>
+        </w:rPr>
       </w:r>
     </w:p>
     <w:p>
@@ -18357,7 +19227,7 @@
         <w:shd w:fill="auto" w:val="clear"/>
         <w:spacing w:after="80" w:before="0" w:line="240" w:lineRule="auto"/>
         <w:ind w:left="720" w:right="0" w:hanging="360"/>
-        <w:jc w:val="left"/>
+        <w:jc w:val="both"/>
         <w:rPr/>
       </w:pPr>
       <w:r>
@@ -18379,6 +19249,11 @@
         </w:rPr>
         <w:t xml:space="preserve">Variáveis CSS definidas no arquivo app/assets/tailwind/application.css</w:t>
       </w:r>
+      <w:r>
+        <w:rPr>
+          <w:rtl w:val="0"/>
+        </w:rPr>
+      </w:r>
     </w:p>
     <w:p>
       <w:pPr>
@@ -18416,6 +19291,7 @@
     <w:p>
       <w:pPr>
         <w:spacing w:after="120" w:lineRule="auto"/>
+        <w:jc w:val="both"/>
         <w:rPr/>
       </w:pPr>
       <w:r>
@@ -18425,7 +19301,22 @@
           <w:szCs w:val="22"/>
           <w:rtl w:val="0"/>
         </w:rPr>
-        <w:t xml:space="preserve">Todas as telas foram desenvolvidas com responsividade completa para desktop e mobile. A navbar colapsa em menu hambúrguer em telas menores. Os cards de dashboard reorganizam em coluna única. Tabelas possuem scroll horizontal quando necessário.</w:t>
+        <w:t xml:space="preserve">Todas as telas foram desenvolvidas com responsividade </w:t>
+      </w:r>
+      <w:r>
+        <w:rPr>
+          <w:rtl w:val="0"/>
+        </w:rPr>
+        <w:t xml:space="preserve">“completa” </w:t>
+      </w:r>
+      <w:r>
+        <w:rPr>
+          <w:rFonts w:ascii="Arial" w:cs="Arial" w:eastAsia="Arial" w:hAnsi="Arial"/>
+          <w:sz w:val="22"/>
+          <w:szCs w:val="22"/>
+          <w:rtl w:val="0"/>
+        </w:rPr>
+        <w:t xml:space="preserve">para desktop e mobile. A navbar colapsa em menu hambúrguer em telas menores. Os cards de dashboard reorganizam em coluna única. Tabelas possuem scroll horizontal quando necessário.</w:t>
       </w:r>
       <w:r>
         <w:rPr>
@@ -18657,7 +19548,7 @@
           <w:szCs w:val="20"/>
           <w:rtl w:val="0"/>
         </w:rPr>
-        <w:t xml:space="preserve">│   │   ├── comentarios_controller.rb     # regras pode_comentar?</w:t>
+        <w:t xml:space="preserve">│   │   ├── comentarios_controller.rb     # criação de comentários</w:t>
       </w:r>
       <w:r>
         <w:rPr>
@@ -19053,7 +19944,7 @@
           <w:szCs w:val="20"/>
           <w:rtl w:val="0"/>
         </w:rPr>
-        <w:t xml:space="preserve">│   ├── migrate/                         # 16 migrations versionadas</w:t>
+        <w:t xml:space="preserve">│   ├── migrate/                         # 17 migrations versionadas</w:t>
       </w:r>
       <w:r>
         <w:rPr>
@@ -19295,7 +20186,7 @@
           <w:szCs w:val="20"/>
           <w:rtl w:val="0"/>
         </w:rPr>
-        <w:t xml:space="preserve">│       ├── aws_r2.rb                    # config do storage S3/R2</w:t>
+        <w:t xml:space="preserve">│       ├── aws_r2.rb                    # config do storage</w:t>
       </w:r>
       <w:r>
         <w:rPr>
@@ -19495,6 +20386,7 @@
     <w:p>
       <w:pPr>
         <w:spacing w:after="120" w:lineRule="auto"/>
+        <w:jc w:val="both"/>
         <w:rPr/>
       </w:pPr>
       <w:r>
@@ -19548,6 +20440,7 @@
     <w:p>
       <w:pPr>
         <w:spacing w:after="120" w:lineRule="auto"/>
+        <w:jc w:val="both"/>
         <w:rPr/>
       </w:pPr>
       <w:r>
@@ -19601,6 +20494,7 @@
     <w:p>
       <w:pPr>
         <w:spacing w:after="120" w:lineRule="auto"/>
+        <w:jc w:val="both"/>
         <w:rPr/>
       </w:pPr>
       <w:r>
@@ -19654,6 +20548,7 @@
     <w:p>
       <w:pPr>
         <w:spacing w:after="120" w:lineRule="auto"/>
+        <w:jc w:val="both"/>
         <w:rPr/>
       </w:pPr>
       <w:r>
@@ -19707,6 +20602,7 @@
     <w:p>
       <w:pPr>
         <w:spacing w:after="120" w:lineRule="auto"/>
+        <w:jc w:val="both"/>
         <w:rPr/>
       </w:pPr>
       <w:r>
@@ -19760,6 +20656,7 @@
     <w:p>
       <w:pPr>
         <w:spacing w:after="120" w:lineRule="auto"/>
+        <w:jc w:val="both"/>
         <w:rPr/>
       </w:pPr>
       <w:r>
@@ -19813,6 +20710,7 @@
     <w:p>
       <w:pPr>
         <w:spacing w:after="120" w:lineRule="auto"/>
+        <w:jc w:val="both"/>
         <w:rPr/>
       </w:pPr>
       <w:r>
@@ -19822,7 +20720,37 @@
           <w:szCs w:val="22"/>
           <w:rtl w:val="0"/>
         </w:rPr>
-        <w:t xml:space="preserve">Implementação do tema escuro com paleta da empresa Dunnas (#152338, #1a2e4a, #7c3aed). Navbar fixa e responsiva. Dashboard com cards de métricas. Filtros de chamados estilizados. Todas as views refatoradas com Tailwind CSS. Adição de funcionalidades extras: log de auditoria, arquivamento automático, upload de anexos, vinculação de colaboradores a tipos.</w:t>
+        <w:t xml:space="preserve">Implementação do tema escuro/clar</w:t>
+      </w:r>
+      <w:r>
+        <w:rPr>
+          <w:rtl w:val="0"/>
+        </w:rPr>
+        <w:t xml:space="preserve">o</w:t>
+      </w:r>
+      <w:r>
+        <w:rPr>
+          <w:rFonts w:ascii="Arial" w:cs="Arial" w:eastAsia="Arial" w:hAnsi="Arial"/>
+          <w:sz w:val="22"/>
+          <w:szCs w:val="22"/>
+          <w:rtl w:val="0"/>
+        </w:rPr>
+        <w:t xml:space="preserve"> com paleta tons de roxo inspirada </w:t>
+      </w:r>
+      <w:r>
+        <w:rPr>
+          <w:rtl w:val="0"/>
+        </w:rPr>
+        <w:t xml:space="preserve">n</w:t>
+      </w:r>
+      <w:r>
+        <w:rPr>
+          <w:rFonts w:ascii="Arial" w:cs="Arial" w:eastAsia="Arial" w:hAnsi="Arial"/>
+          <w:sz w:val="22"/>
+          <w:szCs w:val="22"/>
+          <w:rtl w:val="0"/>
+        </w:rPr>
+        <w:t xml:space="preserve">a Dunnas (#152338, #1a2e4a, #7c3aed). Navbar fixa e responsiva. Dashboard com cards de métricas. Filtros de chamados estilizados. Todas as views refatoradas com Tailwind CSS. Adição de funcionalidades extras: log de auditoria, arquivamento automático, upload de anexos, vinculação de colaboradores a tipos.</w:t>
       </w:r>
       <w:r>
         <w:rPr>
@@ -21556,6 +22484,90 @@
           </w:p>
         </w:tc>
       </w:tr>
+      <w:tr>
+        <w:trPr>
+          <w:cantSplit w:val="0"/>
+          <w:tblHeader w:val="0"/>
+        </w:trPr>
+        <w:tc>
+          <w:tcPr>
+            <w:tcBorders>
+              <w:top w:color="ddd0f5" w:space="0" w:sz="4" w:val="single"/>
+              <w:left w:color="ddd0f5" w:space="0" w:sz="4" w:val="single"/>
+              <w:bottom w:color="ddd0f5" w:space="0" w:sz="4" w:val="single"/>
+              <w:right w:color="ddd0f5" w:space="0" w:sz="4" w:val="single"/>
+            </w:tcBorders>
+            <w:shd w:fill="ffffff" w:val="clear"/>
+            <w:tcMar>
+              <w:top w:w="80.0" w:type="dxa"/>
+              <w:left w:w="140.0" w:type="dxa"/>
+              <w:bottom w:w="80.0" w:type="dxa"/>
+              <w:right w:w="140.0" w:type="dxa"/>
+            </w:tcMar>
+          </w:tcPr>
+          <w:p>
+            <w:pPr>
+              <w:rPr>
+                <w:rFonts w:ascii="Arial" w:cs="Arial" w:eastAsia="Arial" w:hAnsi="Arial"/>
+                <w:sz w:val="20"/>
+                <w:szCs w:val="20"/>
+              </w:rPr>
+            </w:pPr>
+            <w:r>
+              <w:rPr>
+                <w:sz w:val="20"/>
+                <w:szCs w:val="20"/>
+                <w:rtl w:val="0"/>
+              </w:rPr>
+              <w:t xml:space="preserve">Cloudflare R2</w:t>
+            </w:r>
+            <w:r>
+              <w:rPr>
+                <w:rtl w:val="0"/>
+              </w:rPr>
+            </w:r>
+          </w:p>
+        </w:tc>
+        <w:tc>
+          <w:tcPr>
+            <w:tcBorders>
+              <w:top w:color="ddd0f5" w:space="0" w:sz="4" w:val="single"/>
+              <w:left w:color="ddd0f5" w:space="0" w:sz="4" w:val="single"/>
+              <w:bottom w:color="ddd0f5" w:space="0" w:sz="4" w:val="single"/>
+              <w:right w:color="ddd0f5" w:space="0" w:sz="4" w:val="single"/>
+            </w:tcBorders>
+            <w:shd w:fill="ffffff" w:val="clear"/>
+            <w:tcMar>
+              <w:top w:w="80.0" w:type="dxa"/>
+              <w:left w:w="140.0" w:type="dxa"/>
+              <w:bottom w:w="80.0" w:type="dxa"/>
+              <w:right w:w="140.0" w:type="dxa"/>
+            </w:tcMar>
+          </w:tcPr>
+          <w:p>
+            <w:pPr>
+              <w:rPr>
+                <w:rFonts w:ascii="Arial" w:cs="Arial" w:eastAsia="Arial" w:hAnsi="Arial"/>
+                <w:sz w:val="20"/>
+                <w:szCs w:val="20"/>
+              </w:rPr>
+            </w:pPr>
+            <w:r>
+              <w:rPr>
+                <w:sz w:val="20"/>
+                <w:szCs w:val="20"/>
+                <w:rtl w:val="0"/>
+              </w:rPr>
+              <w:t xml:space="preserve">Serviço de armazenamento de arquivos em nuvem compatível com a API S3, usado para guardar os anexos em produção</w:t>
+            </w:r>
+            <w:r>
+              <w:rPr>
+                <w:rtl w:val="0"/>
+              </w:rPr>
+            </w:r>
+          </w:p>
+        </w:tc>
+      </w:tr>
     </w:tbl>
     <w:p>
       <w:pPr>
@@ -21934,40 +22946,13 @@
           <w:vertAlign w:val="baseline"/>
           <w:rtl w:val="0"/>
         </w:rPr>
-        <w:t xml:space="preserve">O upload de anexos usa Active Storage nativo do Rails com suporte configurado para AWS S3/R2 em produção</w:t>
-      </w:r>
-    </w:p>
-    <w:p>
-      <w:pPr>
-        <w:rPr/>
-      </w:pPr>
-      <w:r>
-        <w:rPr>
-          <w:rtl w:val="0"/>
-        </w:rPr>
-      </w:r>
-    </w:p>
-    <w:p>
-      <w:pPr>
-        <w:pStyle w:val="Heading2"/>
-        <w:rPr/>
-      </w:pPr>
-      <w:r>
-        <w:rPr>
-          <w:rFonts w:ascii="Arial" w:cs="Arial" w:eastAsia="Arial" w:hAnsi="Arial"/>
-          <w:b w:val="1"/>
-          <w:bCs w:val="1"/>
-          <w:color w:val="5b21b6"/>
-          <w:sz w:val="26"/>
-          <w:szCs w:val="26"/>
-          <w:rtl w:val="0"/>
-        </w:rPr>
-        <w:t xml:space="preserve">13.2 Pontos de Expansão Futura</w:t>
-      </w:r>
-      <w:r>
-        <w:rPr>
-          <w:rtl w:val="0"/>
-        </w:rPr>
+        <w:t xml:space="preserve">O upload de anexos usa Active Storage nativo do Rails com </w:t>
+      </w:r>
+      <w:r>
+        <w:rPr>
+          <w:rtl w:val="0"/>
+        </w:rPr>
+        <w:t xml:space="preserve">suporte configurado para Cloudflare R2</w:t>
       </w:r>
     </w:p>
     <w:p>
@@ -21991,26 +22976,88 @@
         <w:spacing w:after="80" w:before="0" w:line="240" w:lineRule="auto"/>
         <w:ind w:left="720" w:right="0" w:hanging="360"/>
         <w:jc w:val="left"/>
+        <w:rPr>
+          <w:u w:val="none"/>
+        </w:rPr>
+      </w:pPr>
+      <w:r>
+        <w:rPr>
+          <w:rtl w:val="0"/>
+        </w:rPr>
+        <w:t xml:space="preserve">Uma rota administrativa com chave secreta foi criada para permitir o reset dos dados diretamente pelo painel do Render, sem necessidade de acesso ao terminal</w:t>
+      </w:r>
+    </w:p>
+    <w:p>
+      <w:pPr>
+        <w:keepNext w:val="0"/>
+        <w:keepLines w:val="0"/>
+        <w:pageBreakBefore w:val="0"/>
+        <w:widowControl w:val="1"/>
+        <w:pBdr>
+          <w:top w:space="0" w:sz="0" w:val="nil"/>
+          <w:left w:space="0" w:sz="0" w:val="nil"/>
+          <w:bottom w:space="0" w:sz="0" w:val="nil"/>
+          <w:right w:space="0" w:sz="0" w:val="nil"/>
+          <w:between w:space="0" w:sz="0" w:val="nil"/>
+        </w:pBdr>
+        <w:shd w:fill="auto" w:val="clear"/>
+        <w:spacing w:after="80" w:before="0" w:line="240" w:lineRule="auto"/>
+        <w:ind w:left="720" w:right="0" w:firstLine="0"/>
+        <w:jc w:val="left"/>
+        <w:rPr/>
+      </w:pPr>
+      <w:r>
+        <w:rPr>
+          <w:rtl w:val="0"/>
+        </w:rPr>
+        <w:tab/>
+        <w:t xml:space="preserve"> </w:t>
+      </w:r>
+      <w:r>
+        <w:rPr>
+          <w:rFonts w:ascii="Roboto Mono" w:cs="Roboto Mono" w:eastAsia="Roboto Mono" w:hAnsi="Roboto Mono"/>
+          <w:color w:val="188038"/>
+          <w:rtl w:val="0"/>
+        </w:rPr>
+        <w:t xml:space="preserve">/admin/reset?token=umasenhaforte123</w:t>
+      </w:r>
+      <w:r>
+        <w:rPr>
+          <w:rtl w:val="0"/>
+        </w:rPr>
+      </w:r>
+    </w:p>
+    <w:p>
+      <w:pPr>
+        <w:rPr/>
+      </w:pPr>
+      <w:r>
+        <w:rPr>
+          <w:rtl w:val="0"/>
+        </w:rPr>
+      </w:r>
+    </w:p>
+    <w:p>
+      <w:pPr>
+        <w:pStyle w:val="Heading2"/>
         <w:rPr/>
       </w:pPr>
       <w:r>
         <w:rPr>
           <w:rFonts w:ascii="Arial" w:cs="Arial" w:eastAsia="Arial" w:hAnsi="Arial"/>
-          <w:b w:val="0"/>
-          <w:bCs w:val="0"/>
-          <w:i w:val="0"/>
-          <w:iCs w:val="0"/>
-          <w:smallCaps w:val="0"/>
-          <w:strike w:val="0"/>
-          <w:color w:val="000000"/>
-          <w:sz w:val="22"/>
-          <w:szCs w:val="22"/>
-          <w:u w:val="none"/>
-          <w:shd w:fill="auto" w:val="clear"/>
-          <w:vertAlign w:val="baseline"/>
-          <w:rtl w:val="0"/>
-        </w:rPr>
-        <w:t xml:space="preserve">Implementar lógica completa de verificação de permissões granulares (tabelas criadas, lógica expandível)</w:t>
+          <w:b w:val="1"/>
+          <w:bCs w:val="1"/>
+          <w:color w:val="5b21b6"/>
+          <w:sz w:val="26"/>
+          <w:szCs w:val="26"/>
+          <w:rtl w:val="0"/>
+        </w:rPr>
+        <w:t xml:space="preserve">13.2 Pontos de Expansão Futura</w:t>
+      </w:r>
+      <w:r>
+        <w:rPr>
+          <w:rtl w:val="0"/>
+        </w:rPr>
       </w:r>
     </w:p>
     <w:p>
@@ -22053,7 +23100,7 @@
           <w:vertAlign w:val="baseline"/>
           <w:rtl w:val="0"/>
         </w:rPr>
-        <w:t xml:space="preserve">Notificações por e-mail ao abrir ou atualizar chamados (infrastructure já existe com Devise mailer)</w:t>
+        <w:t xml:space="preserve">Implementar uma lógica completa de verificação de permissões granulares (tabelas criadas, lógica expandível)</w:t>
       </w:r>
     </w:p>
     <w:p>
@@ -22096,7 +23143,7 @@
           <w:vertAlign w:val="baseline"/>
           <w:rtl w:val="0"/>
         </w:rPr>
-        <w:t xml:space="preserve">Relatórios e exportação de chamados em CSV ou PDF</w:t>
+        <w:t xml:space="preserve">Notificações por e-mail ao abrir ou atualizar chamados (infrastructure já existe com Devise mailer)</w:t>
       </w:r>
     </w:p>
     <w:p>
@@ -22139,7 +23186,7 @@
           <w:vertAlign w:val="baseline"/>
           <w:rtl w:val="0"/>
         </w:rPr>
-        <w:t xml:space="preserve">API REST para consumo por aplicativos mobile</w:t>
+        <w:t xml:space="preserve">Relatórios e exportação de chamados em CSV ou PDF</w:t>
       </w:r>
     </w:p>
     <w:p>
@@ -22182,7 +23229,7 @@
           <w:vertAlign w:val="baseline"/>
           <w:rtl w:val="0"/>
         </w:rPr>
-        <w:t xml:space="preserve">Painel de métricas com gráficos de chamados por tipo, status e período</w:t>
+        <w:t xml:space="preserve">API REST para consumo por aplicativos mobile</w:t>
       </w:r>
     </w:p>
     <w:p>
@@ -22225,40 +23272,7 @@
           <w:vertAlign w:val="baseline"/>
           <w:rtl w:val="0"/>
         </w:rPr>
-        <w:t xml:space="preserve">Notificações em tempo real usando Turbo Streams + Action Cable</w:t>
-      </w:r>
-    </w:p>
-    <w:p>
-      <w:pPr>
-        <w:rPr/>
-      </w:pPr>
-      <w:r>
-        <w:rPr>
-          <w:rtl w:val="0"/>
-        </w:rPr>
-      </w:r>
-    </w:p>
-    <w:p>
-      <w:pPr>
-        <w:pStyle w:val="Heading2"/>
-        <w:rPr/>
-      </w:pPr>
-      <w:r>
-        <w:rPr>
-          <w:rFonts w:ascii="Arial" w:cs="Arial" w:eastAsia="Arial" w:hAnsi="Arial"/>
-          <w:b w:val="1"/>
-          <w:bCs w:val="1"/>
-          <w:color w:val="5b21b6"/>
-          <w:sz w:val="26"/>
-          <w:szCs w:val="26"/>
-          <w:rtl w:val="0"/>
-        </w:rPr>
-        <w:t xml:space="preserve">13.3 Como Personalizar Esta Documentação</w:t>
-      </w:r>
-      <w:r>
-        <w:rPr>
-          <w:rtl w:val="0"/>
-        </w:rPr>
+        <w:t xml:space="preserve">Painel de métricas com gráficos de chamados por tipo, status e período</w:t>
       </w:r>
     </w:p>
     <w:p>
@@ -22301,187 +23315,18 @@
           <w:vertAlign w:val="baseline"/>
           <w:rtl w:val="0"/>
         </w:rPr>
-        <w:t xml:space="preserve">Inserir o diagrama relacional do banco de dados como imagem na seção 4</w:t>
-      </w:r>
-    </w:p>
-    <w:p>
-      <w:pPr>
-        <w:keepNext w:val="0"/>
-        <w:keepLines w:val="0"/>
-        <w:pageBreakBefore w:val="0"/>
-        <w:widowControl w:val="1"/>
-        <w:numPr>
-          <w:ilvl w:val="0"/>
-          <w:numId w:val="1"/>
-        </w:numPr>
-        <w:pBdr>
-          <w:top w:space="0" w:sz="0" w:val="nil"/>
-          <w:left w:space="0" w:sz="0" w:val="nil"/>
-          <w:bottom w:space="0" w:sz="0" w:val="nil"/>
-          <w:right w:space="0" w:sz="0" w:val="nil"/>
-          <w:between w:space="0" w:sz="0" w:val="nil"/>
-        </w:pBdr>
-        <w:shd w:fill="auto" w:val="clear"/>
-        <w:spacing w:after="80" w:before="0" w:line="240" w:lineRule="auto"/>
-        <w:ind w:left="720" w:right="0" w:hanging="360"/>
-        <w:jc w:val="left"/>
-        <w:rPr/>
-      </w:pPr>
-      <w:r>
-        <w:rPr>
-          <w:rFonts w:ascii="Arial" w:cs="Arial" w:eastAsia="Arial" w:hAnsi="Arial"/>
-          <w:b w:val="0"/>
-          <w:bCs w:val="0"/>
-          <w:i w:val="0"/>
-          <w:iCs w:val="0"/>
-          <w:smallCaps w:val="0"/>
-          <w:strike w:val="0"/>
-          <w:color w:val="000000"/>
-          <w:sz w:val="22"/>
-          <w:szCs w:val="22"/>
-          <w:u w:val="none"/>
-          <w:shd w:fill="auto" w:val="clear"/>
-          <w:vertAlign w:val="baseline"/>
-          <w:rtl w:val="0"/>
-        </w:rPr>
-        <w:t xml:space="preserve">Adicionar capturas de tela das principais telas na seção 9</w:t>
-      </w:r>
-    </w:p>
-    <w:p>
-      <w:pPr>
-        <w:keepNext w:val="0"/>
-        <w:keepLines w:val="0"/>
-        <w:pageBreakBefore w:val="0"/>
-        <w:widowControl w:val="1"/>
-        <w:numPr>
-          <w:ilvl w:val="0"/>
-          <w:numId w:val="1"/>
-        </w:numPr>
-        <w:pBdr>
-          <w:top w:space="0" w:sz="0" w:val="nil"/>
-          <w:left w:space="0" w:sz="0" w:val="nil"/>
-          <w:bottom w:space="0" w:sz="0" w:val="nil"/>
-          <w:right w:space="0" w:sz="0" w:val="nil"/>
-          <w:between w:space="0" w:sz="0" w:val="nil"/>
-        </w:pBdr>
-        <w:shd w:fill="auto" w:val="clear"/>
-        <w:spacing w:after="80" w:before="0" w:line="240" w:lineRule="auto"/>
-        <w:ind w:left="720" w:right="0" w:hanging="360"/>
-        <w:jc w:val="left"/>
-        <w:rPr/>
-      </w:pPr>
-      <w:r>
-        <w:rPr>
-          <w:rFonts w:ascii="Arial" w:cs="Arial" w:eastAsia="Arial" w:hAnsi="Arial"/>
-          <w:b w:val="0"/>
-          <w:bCs w:val="0"/>
-          <w:i w:val="0"/>
-          <w:iCs w:val="0"/>
-          <w:smallCaps w:val="0"/>
-          <w:strike w:val="0"/>
-          <w:color w:val="000000"/>
-          <w:sz w:val="22"/>
-          <w:szCs w:val="22"/>
-          <w:u w:val="none"/>
-          <w:shd w:fill="auto" w:val="clear"/>
-          <w:vertAlign w:val="baseline"/>
-          <w:rtl w:val="0"/>
-        </w:rPr>
-        <w:t xml:space="preserve">Atualizar o link do repositório Git na seção 7</w:t>
-      </w:r>
-    </w:p>
-    <w:p>
-      <w:pPr>
-        <w:keepNext w:val="0"/>
-        <w:keepLines w:val="0"/>
-        <w:pageBreakBefore w:val="0"/>
-        <w:widowControl w:val="1"/>
-        <w:numPr>
-          <w:ilvl w:val="0"/>
-          <w:numId w:val="1"/>
-        </w:numPr>
-        <w:pBdr>
-          <w:top w:space="0" w:sz="0" w:val="nil"/>
-          <w:left w:space="0" w:sz="0" w:val="nil"/>
-          <w:bottom w:space="0" w:sz="0" w:val="nil"/>
-          <w:right w:space="0" w:sz="0" w:val="nil"/>
-          <w:between w:space="0" w:sz="0" w:val="nil"/>
-        </w:pBdr>
-        <w:shd w:fill="auto" w:val="clear"/>
-        <w:spacing w:after="80" w:before="0" w:line="240" w:lineRule="auto"/>
-        <w:ind w:left="720" w:right="0" w:hanging="360"/>
-        <w:jc w:val="left"/>
-        <w:rPr/>
-      </w:pPr>
-      <w:r>
-        <w:rPr>
-          <w:rFonts w:ascii="Arial" w:cs="Arial" w:eastAsia="Arial" w:hAnsi="Arial"/>
-          <w:b w:val="0"/>
-          <w:bCs w:val="0"/>
-          <w:i w:val="0"/>
-          <w:iCs w:val="0"/>
-          <w:smallCaps w:val="0"/>
-          <w:strike w:val="0"/>
-          <w:color w:val="000000"/>
-          <w:sz w:val="22"/>
-          <w:szCs w:val="22"/>
-          <w:u w:val="none"/>
-          <w:shd w:fill="auto" w:val="clear"/>
-          <w:vertAlign w:val="baseline"/>
-          <w:rtl w:val="0"/>
-        </w:rPr>
-        <w:t xml:space="preserve">Ajustar versões exatas das gems conforme o Gemfile.lock</w:t>
-      </w:r>
-    </w:p>
-    <w:p>
-      <w:pPr>
-        <w:keepNext w:val="0"/>
-        <w:keepLines w:val="0"/>
-        <w:pageBreakBefore w:val="0"/>
-        <w:widowControl w:val="1"/>
-        <w:numPr>
-          <w:ilvl w:val="0"/>
-          <w:numId w:val="1"/>
-        </w:numPr>
-        <w:pBdr>
-          <w:top w:space="0" w:sz="0" w:val="nil"/>
-          <w:left w:space="0" w:sz="0" w:val="nil"/>
-          <w:bottom w:space="0" w:sz="0" w:val="nil"/>
-          <w:right w:space="0" w:sz="0" w:val="nil"/>
-          <w:between w:space="0" w:sz="0" w:val="nil"/>
-        </w:pBdr>
-        <w:shd w:fill="auto" w:val="clear"/>
-        <w:spacing w:after="80" w:before="0" w:line="240" w:lineRule="auto"/>
-        <w:ind w:left="720" w:right="0" w:hanging="360"/>
-        <w:jc w:val="left"/>
-        <w:rPr/>
-      </w:pPr>
-      <w:r>
-        <w:rPr>
-          <w:rFonts w:ascii="Arial" w:cs="Arial" w:eastAsia="Arial" w:hAnsi="Arial"/>
-          <w:b w:val="0"/>
-          <w:bCs w:val="0"/>
-          <w:i w:val="0"/>
-          <w:iCs w:val="0"/>
-          <w:smallCaps w:val="0"/>
-          <w:strike w:val="0"/>
-          <w:color w:val="000000"/>
-          <w:sz w:val="22"/>
-          <w:szCs w:val="22"/>
-          <w:u w:val="none"/>
-          <w:shd w:fill="auto" w:val="clear"/>
-          <w:vertAlign w:val="baseline"/>
-          <w:rtl w:val="0"/>
-        </w:rPr>
-        <w:t xml:space="preserve">Incluir a URL de produção (Render ou outro serviço) nas instruções de acesso</w:t>
+        <w:t xml:space="preserve">Notificações em tempo real usando Turbo Streams + Action Cable</w:t>
       </w:r>
     </w:p>
     <w:sectPr>
-      <w:headerReference r:id="rId6" w:type="default"/>
-      <w:footerReference r:id="rId7" w:type="default"/>
+      <w:headerReference r:id="rId17" w:type="default"/>
+      <w:headerReference r:id="rId18" w:type="first"/>
+      <w:footerReference r:id="rId19" w:type="default"/>
+      <w:footerReference r:id="rId20" w:type="first"/>
       <w:pgSz w:h="16838" w:w="11906" w:orient="portrait"/>
       <w:pgMar w:bottom="1440" w:top="1440" w:left="1440" w:right="1440" w:header="708" w:footer="708"/>
       <w:pgNumType w:start="1"/>
+      <w:titlePg w:val="1"/>
     </w:sectPr>
   </w:body>
 </w:document>
@@ -22551,6 +23396,21 @@
 </w:ftr>
 </file>
 
+<file path=word/footer2.xml><?xml version="1.0" encoding="utf-8"?>
+<w:ftr xmlns:mc="http://schemas.openxmlformats.org/markup-compatibility/2006" xmlns:o="urn:schemas-microsoft-com:office:office" xmlns:r="http://schemas.openxmlformats.org/officeDocument/2006/relationships" xmlns:m="http://schemas.openxmlformats.org/officeDocument/2006/math" xmlns:v="urn:schemas-microsoft-com:vml" xmlns:wp="http://schemas.openxmlformats.org/drawingml/2006/wordprocessingDrawing" xmlns:w10="urn:schemas-microsoft-com:office:word" xmlns:w="http://schemas.openxmlformats.org/wordprocessingml/2006/main" xmlns:wne="http://schemas.microsoft.com/office/word/2006/wordml" xmlns:sl="http://schemas.openxmlformats.org/schemaLibrary/2006/main" xmlns:a="http://schemas.openxmlformats.org/drawingml/2006/main" xmlns:pic="http://schemas.openxmlformats.org/drawingml/2006/picture" xmlns:c="http://schemas.openxmlformats.org/drawingml/2006/chart" xmlns:lc="http://schemas.openxmlformats.org/drawingml/2006/lockedCanvas" xmlns:dgm="http://schemas.openxmlformats.org/drawingml/2006/diagram" xmlns:wps="http://schemas.microsoft.com/office/word/2010/wordprocessingShape" xmlns:wpg="http://schemas.microsoft.com/office/word/2010/wordprocessingGroup" xmlns:w14="http://schemas.microsoft.com/office/word/2010/wordml" xmlns:w15="http://schemas.microsoft.com/office/word/2012/wordml" xmlns:w16="http://schemas.microsoft.com/office/word/2018/wordml" xmlns:w16cex="http://schemas.microsoft.com/office/word/2018/wordml/cex" xmlns:w16cid="http://schemas.microsoft.com/office/word/2016/wordml/cid" xmlns="http://schemas.microsoft.com/office/tasks/2019/documenttasks" xmlns:cr="http://schemas.microsoft.com/office/comments/2020/reactions">
+  <w:p>
+    <w:pPr>
+      <w:rPr/>
+    </w:pPr>
+    <w:r>
+      <w:rPr>
+        <w:rtl w:val="0"/>
+      </w:rPr>
+    </w:r>
+  </w:p>
+</w:ftr>
+</file>
+
 <file path=word/header1.xml><?xml version="1.0" encoding="utf-8"?>
 <w:hdr xmlns:mc="http://schemas.openxmlformats.org/markup-compatibility/2006" xmlns:o="urn:schemas-microsoft-com:office:office" xmlns:r="http://schemas.openxmlformats.org/officeDocument/2006/relationships" xmlns:m="http://schemas.openxmlformats.org/officeDocument/2006/math" xmlns:v="urn:schemas-microsoft-com:vml" xmlns:wp="http://schemas.openxmlformats.org/drawingml/2006/wordprocessingDrawing" xmlns:w10="urn:schemas-microsoft-com:office:word" xmlns:w="http://schemas.openxmlformats.org/wordprocessingml/2006/main" xmlns:wne="http://schemas.microsoft.com/office/word/2006/wordml" xmlns:sl="http://schemas.openxmlformats.org/schemaLibrary/2006/main" xmlns:a="http://schemas.openxmlformats.org/drawingml/2006/main" xmlns:pic="http://schemas.openxmlformats.org/drawingml/2006/picture" xmlns:c="http://schemas.openxmlformats.org/drawingml/2006/chart" xmlns:lc="http://schemas.openxmlformats.org/drawingml/2006/lockedCanvas" xmlns:dgm="http://schemas.openxmlformats.org/drawingml/2006/diagram" xmlns:wps="http://schemas.microsoft.com/office/word/2010/wordprocessingShape" xmlns:wpg="http://schemas.microsoft.com/office/word/2010/wordprocessingGroup" xmlns:w14="http://schemas.microsoft.com/office/word/2010/wordml" xmlns:w15="http://schemas.microsoft.com/office/word/2012/wordml" xmlns:w16="http://schemas.microsoft.com/office/word/2018/wordml" xmlns:w16cex="http://schemas.microsoft.com/office/word/2018/wordml/cex" xmlns:w16cid="http://schemas.microsoft.com/office/word/2016/wordml/cid" xmlns="http://schemas.microsoft.com/office/tasks/2019/documenttasks" xmlns:cr="http://schemas.microsoft.com/office/comments/2020/reactions">
   <w:p>
@@ -22593,6 +23453,21 @@
       </w:rPr>
       <w:t xml:space="preserve">    |    Documentação Técnica</w:t>
     </w:r>
+    <w:r>
+      <w:rPr>
+        <w:rtl w:val="0"/>
+      </w:rPr>
+    </w:r>
+  </w:p>
+</w:hdr>
+</file>
+
+<file path=word/header2.xml><?xml version="1.0" encoding="utf-8"?>
+<w:hdr xmlns:mc="http://schemas.openxmlformats.org/markup-compatibility/2006" xmlns:o="urn:schemas-microsoft-com:office:office" xmlns:r="http://schemas.openxmlformats.org/officeDocument/2006/relationships" xmlns:m="http://schemas.openxmlformats.org/officeDocument/2006/math" xmlns:v="urn:schemas-microsoft-com:vml" xmlns:wp="http://schemas.openxmlformats.org/drawingml/2006/wordprocessingDrawing" xmlns:w10="urn:schemas-microsoft-com:office:word" xmlns:w="http://schemas.openxmlformats.org/wordprocessingml/2006/main" xmlns:wne="http://schemas.microsoft.com/office/word/2006/wordml" xmlns:sl="http://schemas.openxmlformats.org/schemaLibrary/2006/main" xmlns:a="http://schemas.openxmlformats.org/drawingml/2006/main" xmlns:pic="http://schemas.openxmlformats.org/drawingml/2006/picture" xmlns:c="http://schemas.openxmlformats.org/drawingml/2006/chart" xmlns:lc="http://schemas.openxmlformats.org/drawingml/2006/lockedCanvas" xmlns:dgm="http://schemas.openxmlformats.org/drawingml/2006/diagram" xmlns:wps="http://schemas.microsoft.com/office/word/2010/wordprocessingShape" xmlns:wpg="http://schemas.microsoft.com/office/word/2010/wordprocessingGroup" xmlns:w14="http://schemas.microsoft.com/office/word/2010/wordml" xmlns:w15="http://schemas.microsoft.com/office/word/2012/wordml" xmlns:w16="http://schemas.microsoft.com/office/word/2018/wordml" xmlns:w16cex="http://schemas.microsoft.com/office/word/2018/wordml/cex" xmlns:w16cid="http://schemas.microsoft.com/office/word/2016/wordml/cid" xmlns="http://schemas.microsoft.com/office/tasks/2019/documenttasks" xmlns:cr="http://schemas.microsoft.com/office/comments/2020/reactions">
+  <w:p>
+    <w:pPr>
+      <w:rPr/>
+    </w:pPr>
     <w:r>
       <w:rPr>
         <w:rtl w:val="0"/>

</xml_diff>